<commit_message>
Update DER and sql File
</commit_message>
<xml_diff>
--- a/Diagram and SQL File/Diagrama ER Gestion Hospitalaria G21 Alexandro Valdés Piñeda y Javier Soto Villanueva.docx
+++ b/Diagram and SQL File/Diagrama ER Gestion Hospitalaria G21 Alexandro Valdés Piñeda y Javier Soto Villanueva.docx
@@ -1471,7 +1471,7 @@
                                     </pic:cNvPicPr>
                                   </pic:nvPicPr>
                                   <pic:blipFill>
-                                    <a:blip r:embed="rId7">
+                                    <a:blip r:embed="rId9">
                                       <a:extLst>
                                         <a:ext uri="{28A0092B-C50C-407E-A947-70E740481C1C}">
                                           <a14:useLocalDpi xmlns:a14="http://schemas.microsoft.com/office/drawing/2010/main" val="0"/>
@@ -1679,7 +1679,7 @@
                                     </pic:cNvPicPr>
                                   </pic:nvPicPr>
                                   <pic:blipFill>
-                                    <a:blip r:embed="rId7">
+                                    <a:blip r:embed="rId9">
                                       <a:extLst>
                                         <a:ext uri="{28A0092B-C50C-407E-A947-70E740481C1C}">
                                           <a14:useLocalDpi xmlns:a14="http://schemas.microsoft.com/office/drawing/2010/main" val="0"/>
@@ -1875,7 +1875,7 @@
                                     </pic:cNvPicPr>
                                   </pic:nvPicPr>
                                   <pic:blipFill>
-                                    <a:blip r:embed="rId7">
+                                    <a:blip r:embed="rId9">
                                       <a:extLst>
                                         <a:ext uri="{28A0092B-C50C-407E-A947-70E740481C1C}">
                                           <a14:useLocalDpi xmlns:a14="http://schemas.microsoft.com/office/drawing/2010/main" val="0"/>
@@ -2673,7 +2673,7 @@
                                     </pic:cNvPicPr>
                                   </pic:nvPicPr>
                                   <pic:blipFill>
-                                    <a:blip r:embed="rId7">
+                                    <a:blip r:embed="rId9">
                                       <a:extLst>
                                         <a:ext uri="{28A0092B-C50C-407E-A947-70E740481C1C}">
                                           <a14:useLocalDpi xmlns:a14="http://schemas.microsoft.com/office/drawing/2010/main" val="0"/>
@@ -9167,7 +9167,7 @@
                                           </pic:cNvPicPr>
                                         </pic:nvPicPr>
                                         <pic:blipFill>
-                                          <a:blip r:embed="rId7">
+                                          <a:blip r:embed="rId9">
                                             <a:extLst>
                                               <a:ext uri="{28A0092B-C50C-407E-A947-70E740481C1C}">
                                                 <a14:useLocalDpi xmlns:a14="http://schemas.microsoft.com/office/drawing/2010/main" val="0"/>
@@ -9259,7 +9259,7 @@
                                     </pic:cNvPicPr>
                                   </pic:nvPicPr>
                                   <pic:blipFill>
-                                    <a:blip r:embed="rId9">
+                                    <a:blip r:embed="rId10">
                                       <a:extLst>
                                         <a:ext uri="{28A0092B-C50C-407E-A947-70E740481C1C}">
                                           <a14:useLocalDpi xmlns:a14="http://schemas.microsoft.com/office/drawing/2010/main" val="0"/>
@@ -9963,7 +9963,7 @@
                                           </pic:cNvPicPr>
                                         </pic:nvPicPr>
                                         <pic:blipFill>
-                                          <a:blip r:embed="rId7">
+                                          <a:blip r:embed="rId9">
                                             <a:extLst>
                                               <a:ext uri="{28A0092B-C50C-407E-A947-70E740481C1C}">
                                                 <a14:useLocalDpi xmlns:a14="http://schemas.microsoft.com/office/drawing/2010/main" val="0"/>
@@ -10263,7 +10263,7 @@
                                     </pic:cNvPicPr>
                                   </pic:nvPicPr>
                                   <pic:blipFill>
-                                    <a:blip r:embed="rId9">
+                                    <a:blip r:embed="rId10">
                                       <a:extLst>
                                         <a:ext uri="{28A0092B-C50C-407E-A947-70E740481C1C}">
                                           <a14:useLocalDpi xmlns:a14="http://schemas.microsoft.com/office/drawing/2010/main" val="0"/>
@@ -10373,7 +10373,7 @@
                                 <w:b/>
                                 <w:lang w:val="es-ES"/>
                               </w:rPr>
-                              <w:t>Médico</w:t>
+                              <w:t>Docto</w:t>
                             </w:r>
                           </w:p>
                         </w:txbxContent>
@@ -10398,7 +10398,7 @@
           </mc:Choice>
           <mc:Fallback>
             <w:pict>
-              <v:rect w14:anchorId="53834211" id="Rectangle 2" o:spid="_x0000_s1067" style="position:absolute;margin-left:194.7pt;margin-top:381.2pt;width:99.9pt;height:73pt;z-index:251660288;visibility:visible;mso-wrap-style:square;mso-width-percent:0;mso-height-percent:0;mso-wrap-distance-left:9pt;mso-wrap-distance-top:0;mso-wrap-distance-right:9pt;mso-wrap-distance-bottom:0;mso-position-horizontal:absolute;mso-position-horizontal-relative:text;mso-position-vertical:absolute;mso-position-vertical-relative:text;mso-width-percent:0;mso-height-percent:0;mso-width-relative:margin;mso-height-relative:margin;v-text-anchor:middle" o:gfxdata="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" filled="f" strokecolor="#7030a0" strokeweight="1pt">
+              <v:rect w14:anchorId="53834211" id="Rectangle 2" o:spid="_x0000_s1074" style="position:absolute;margin-left:194.7pt;margin-top:381.2pt;width:99.9pt;height:73pt;z-index:251660288;visibility:visible;mso-wrap-style:square;mso-width-percent:0;mso-height-percent:0;mso-wrap-distance-left:9pt;mso-wrap-distance-top:0;mso-wrap-distance-right:9pt;mso-wrap-distance-bottom:0;mso-position-horizontal:absolute;mso-position-horizontal-relative:text;mso-position-vertical:absolute;mso-position-vertical-relative:text;mso-width-percent:0;mso-height-percent:0;mso-width-relative:margin;mso-height-relative:margin;v-text-anchor:middle" o:gfxdata="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" filled="f" strokecolor="#7030a0" strokeweight="1pt">
                 <v:textbox>
                   <w:txbxContent>
                     <w:p>
@@ -10414,7 +10414,7 @@
                           <w:b/>
                           <w:lang w:val="es-ES"/>
                         </w:rPr>
-                        <w:t>Médico</w:t>
+                        <w:t>Docto</w:t>
                       </w:r>
                     </w:p>
                   </w:txbxContent>
@@ -11252,7 +11252,7 @@
                                           </pic:cNvPicPr>
                                         </pic:nvPicPr>
                                         <pic:blipFill>
-                                          <a:blip r:embed="rId7">
+                                          <a:blip r:embed="rId9">
                                             <a:extLst>
                                               <a:ext uri="{28A0092B-C50C-407E-A947-70E740481C1C}">
                                                 <a14:useLocalDpi xmlns:a14="http://schemas.microsoft.com/office/drawing/2010/main" val="0"/>
@@ -11534,7 +11534,7 @@
                                           </pic:cNvPicPr>
                                         </pic:nvPicPr>
                                         <pic:blipFill>
-                                          <a:blip r:embed="rId7">
+                                          <a:blip r:embed="rId9">
                                             <a:extLst>
                                               <a:ext uri="{28A0092B-C50C-407E-A947-70E740481C1C}">
                                                 <a14:useLocalDpi xmlns:a14="http://schemas.microsoft.com/office/drawing/2010/main" val="0"/>
@@ -11814,7 +11814,7 @@
                                           </pic:cNvPicPr>
                                         </pic:nvPicPr>
                                         <pic:blipFill>
-                                          <a:blip r:embed="rId7">
+                                          <a:blip r:embed="rId9">
                                             <a:extLst>
                                               <a:ext uri="{28A0092B-C50C-407E-A947-70E740481C1C}">
                                                 <a14:useLocalDpi xmlns:a14="http://schemas.microsoft.com/office/drawing/2010/main" val="0"/>
@@ -12846,7 +12846,7 @@
                                           </pic:cNvPicPr>
                                         </pic:nvPicPr>
                                         <pic:blipFill>
-                                          <a:blip r:embed="rId7">
+                                          <a:blip r:embed="rId9">
                                             <a:extLst>
                                               <a:ext uri="{28A0092B-C50C-407E-A947-70E740481C1C}">
                                                 <a14:useLocalDpi xmlns:a14="http://schemas.microsoft.com/office/drawing/2010/main" val="0"/>
@@ -13631,7 +13631,7 @@
                                           </pic:cNvPicPr>
                                         </pic:nvPicPr>
                                         <pic:blipFill>
-                                          <a:blip r:embed="rId7">
+                                          <a:blip r:embed="rId9">
                                             <a:extLst>
                                               <a:ext uri="{28A0092B-C50C-407E-A947-70E740481C1C}">
                                                 <a14:useLocalDpi xmlns:a14="http://schemas.microsoft.com/office/drawing/2010/main" val="0"/>
@@ -14028,7 +14028,7 @@
                                           </pic:cNvPicPr>
                                         </pic:nvPicPr>
                                         <pic:blipFill>
-                                          <a:blip r:embed="rId7">
+                                          <a:blip r:embed="rId9">
                                             <a:extLst>
                                               <a:ext uri="{28A0092B-C50C-407E-A947-70E740481C1C}">
                                                 <a14:useLocalDpi xmlns:a14="http://schemas.microsoft.com/office/drawing/2010/main" val="0"/>
@@ -14621,7 +14621,25 @@
           <w:sz w:val="28"/>
           <w:lang w:val="es-ES"/>
         </w:rPr>
-        <w:t xml:space="preserve">DF1: codHospital → </w:t>
+        <w:t xml:space="preserve">DF1: </w:t>
+      </w:r>
+      <w:proofErr w:type="spellStart"/>
+      <w:r>
+        <w:rPr>
+          <w:rFonts w:ascii="Arial" w:hAnsi="Arial" w:cs="Arial"/>
+          <w:sz w:val="28"/>
+          <w:lang w:val="es-ES"/>
+        </w:rPr>
+        <w:t>codHospital</w:t>
+      </w:r>
+      <w:proofErr w:type="spellEnd"/>
+      <w:r>
+        <w:rPr>
+          <w:rFonts w:ascii="Arial" w:hAnsi="Arial" w:cs="Arial"/>
+          <w:sz w:val="28"/>
+          <w:lang w:val="es-ES"/>
+        </w:rPr>
+        <w:t xml:space="preserve"> → </w:t>
       </w:r>
       <w:proofErr w:type="spellStart"/>
       <w:r>
@@ -14666,24 +14684,7 @@
           <w:sz w:val="28"/>
           <w:lang w:val="es-ES"/>
         </w:rPr>
-        <w:t xml:space="preserve"> → nombreDpt, codHospital</w:t>
-      </w:r>
-    </w:p>
-    <w:p>
-      <w:pPr>
-        <w:rPr>
-          <w:rFonts w:ascii="Arial" w:hAnsi="Arial" w:cs="Arial"/>
-          <w:sz w:val="28"/>
-          <w:lang w:val="es-ES"/>
-        </w:rPr>
-      </w:pPr>
-      <w:r>
-        <w:rPr>
-          <w:rFonts w:ascii="Arial" w:hAnsi="Arial" w:cs="Arial"/>
-          <w:sz w:val="28"/>
-          <w:lang w:val="es-ES"/>
-        </w:rPr>
-        <w:t xml:space="preserve">DF3: </w:t>
+        <w:t xml:space="preserve"> → </w:t>
       </w:r>
       <w:proofErr w:type="spellStart"/>
       <w:r>
@@ -14692,7 +14693,7 @@
           <w:sz w:val="28"/>
           <w:lang w:val="es-ES"/>
         </w:rPr>
-        <w:t>codUnidad</w:t>
+        <w:t>nombreDpt</w:t>
       </w:r>
       <w:proofErr w:type="spellEnd"/>
       <w:r>
@@ -14701,7 +14702,7 @@
           <w:sz w:val="28"/>
           <w:lang w:val="es-ES"/>
         </w:rPr>
-        <w:t xml:space="preserve"> → </w:t>
+        <w:t xml:space="preserve">, </w:t>
       </w:r>
       <w:proofErr w:type="spellStart"/>
       <w:r>
@@ -14710,43 +14711,7 @@
           <w:sz w:val="28"/>
           <w:lang w:val="es-ES"/>
         </w:rPr>
-        <w:t>nombreUnidad</w:t>
-      </w:r>
-      <w:proofErr w:type="spellEnd"/>
-      <w:r>
-        <w:rPr>
-          <w:rFonts w:ascii="Arial" w:hAnsi="Arial" w:cs="Arial"/>
-          <w:sz w:val="28"/>
-          <w:lang w:val="es-ES"/>
-        </w:rPr>
-        <w:t xml:space="preserve">, </w:t>
-      </w:r>
-      <w:proofErr w:type="spellStart"/>
-      <w:r>
-        <w:rPr>
-          <w:rFonts w:ascii="Arial" w:hAnsi="Arial" w:cs="Arial"/>
-          <w:sz w:val="28"/>
-          <w:lang w:val="es-ES"/>
-        </w:rPr>
-        <w:t>ubicacion</w:t>
-      </w:r>
-      <w:proofErr w:type="spellEnd"/>
-      <w:r>
-        <w:rPr>
-          <w:rFonts w:ascii="Arial" w:hAnsi="Arial" w:cs="Arial"/>
-          <w:sz w:val="28"/>
-          <w:lang w:val="es-ES"/>
-        </w:rPr>
-        <w:t xml:space="preserve">, </w:t>
-      </w:r>
-      <w:proofErr w:type="spellStart"/>
-      <w:r>
-        <w:rPr>
-          <w:rFonts w:ascii="Arial" w:hAnsi="Arial" w:cs="Arial"/>
-          <w:sz w:val="28"/>
-          <w:lang w:val="es-ES"/>
-        </w:rPr>
-        <w:t>codDpt</w:t>
+        <w:t>codHospital</w:t>
       </w:r>
       <w:proofErr w:type="spellEnd"/>
     </w:p>
@@ -14764,7 +14729,7 @@
           <w:sz w:val="28"/>
           <w:lang w:val="es-ES"/>
         </w:rPr>
-        <w:t xml:space="preserve">DF4: codMedico → </w:t>
+        <w:t xml:space="preserve">DF3: </w:t>
       </w:r>
       <w:proofErr w:type="spellStart"/>
       <w:r>
@@ -14773,7 +14738,7 @@
           <w:sz w:val="28"/>
           <w:lang w:val="es-ES"/>
         </w:rPr>
-        <w:t>nombreMed</w:t>
+        <w:t>codUnidad</w:t>
       </w:r>
       <w:proofErr w:type="spellEnd"/>
       <w:r>
@@ -14782,6 +14747,24 @@
           <w:sz w:val="28"/>
           <w:lang w:val="es-ES"/>
         </w:rPr>
+        <w:t xml:space="preserve"> → </w:t>
+      </w:r>
+      <w:proofErr w:type="spellStart"/>
+      <w:r>
+        <w:rPr>
+          <w:rFonts w:ascii="Arial" w:hAnsi="Arial" w:cs="Arial"/>
+          <w:sz w:val="28"/>
+          <w:lang w:val="es-ES"/>
+        </w:rPr>
+        <w:t>nombreUnidad</w:t>
+      </w:r>
+      <w:proofErr w:type="spellEnd"/>
+      <w:r>
+        <w:rPr>
+          <w:rFonts w:ascii="Arial" w:hAnsi="Arial" w:cs="Arial"/>
+          <w:sz w:val="28"/>
+          <w:lang w:val="es-ES"/>
+        </w:rPr>
         <w:t xml:space="preserve">, </w:t>
       </w:r>
       <w:proofErr w:type="spellStart"/>
@@ -14791,7 +14774,7 @@
           <w:sz w:val="28"/>
           <w:lang w:val="es-ES"/>
         </w:rPr>
-        <w:t>telefono</w:t>
+        <w:t>ubicacion</w:t>
       </w:r>
       <w:proofErr w:type="spellEnd"/>
       <w:r>
@@ -14800,7 +14783,7 @@
           <w:sz w:val="28"/>
           <w:lang w:val="es-ES"/>
         </w:rPr>
-        <w:t xml:space="preserve">, especialidad, numLicencia, experiencia, </w:t>
+        <w:t xml:space="preserve">, </w:t>
       </w:r>
       <w:proofErr w:type="spellStart"/>
       <w:r>
@@ -14809,7 +14792,7 @@
           <w:sz w:val="28"/>
           <w:lang w:val="es-ES"/>
         </w:rPr>
-        <w:t>codUnidad</w:t>
+        <w:t>codDpt</w:t>
       </w:r>
       <w:proofErr w:type="spellEnd"/>
     </w:p>
@@ -14827,7 +14810,7 @@
           <w:sz w:val="28"/>
           <w:lang w:val="es-ES"/>
         </w:rPr>
-        <w:t>DF5: (</w:t>
+        <w:t xml:space="preserve">DF4: </w:t>
       </w:r>
       <w:proofErr w:type="spellStart"/>
       <w:r>
@@ -14836,239 +14819,79 @@
           <w:sz w:val="28"/>
           <w:lang w:val="es-ES"/>
         </w:rPr>
+        <w:t>codMedico</w:t>
+      </w:r>
+      <w:proofErr w:type="spellEnd"/>
+      <w:r>
+        <w:rPr>
+          <w:rFonts w:ascii="Arial" w:hAnsi="Arial" w:cs="Arial"/>
+          <w:sz w:val="28"/>
+          <w:lang w:val="es-ES"/>
+        </w:rPr>
+        <w:t xml:space="preserve"> → </w:t>
+      </w:r>
+      <w:proofErr w:type="spellStart"/>
+      <w:r>
+        <w:rPr>
+          <w:rFonts w:ascii="Arial" w:hAnsi="Arial" w:cs="Arial"/>
+          <w:sz w:val="28"/>
+          <w:lang w:val="es-ES"/>
+        </w:rPr>
+        <w:t>nombreMed</w:t>
+      </w:r>
+      <w:proofErr w:type="spellEnd"/>
+      <w:r>
+        <w:rPr>
+          <w:rFonts w:ascii="Arial" w:hAnsi="Arial" w:cs="Arial"/>
+          <w:sz w:val="28"/>
+          <w:lang w:val="es-ES"/>
+        </w:rPr>
+        <w:t xml:space="preserve">, </w:t>
+      </w:r>
+      <w:proofErr w:type="spellStart"/>
+      <w:r>
+        <w:rPr>
+          <w:rFonts w:ascii="Arial" w:hAnsi="Arial" w:cs="Arial"/>
+          <w:sz w:val="28"/>
+          <w:lang w:val="es-ES"/>
+        </w:rPr>
+        <w:t>telefono</w:t>
+      </w:r>
+      <w:proofErr w:type="spellEnd"/>
+      <w:r>
+        <w:rPr>
+          <w:rFonts w:ascii="Arial" w:hAnsi="Arial" w:cs="Arial"/>
+          <w:sz w:val="28"/>
+          <w:lang w:val="es-ES"/>
+        </w:rPr>
+        <w:t xml:space="preserve">, especialidad, </w:t>
+      </w:r>
+      <w:proofErr w:type="spellStart"/>
+      <w:r>
+        <w:rPr>
+          <w:rFonts w:ascii="Arial" w:hAnsi="Arial" w:cs="Arial"/>
+          <w:sz w:val="28"/>
+          <w:lang w:val="es-ES"/>
+        </w:rPr>
+        <w:t>numLicencia</w:t>
+      </w:r>
+      <w:proofErr w:type="spellEnd"/>
+      <w:r>
+        <w:rPr>
+          <w:rFonts w:ascii="Arial" w:hAnsi="Arial" w:cs="Arial"/>
+          <w:sz w:val="28"/>
+          <w:lang w:val="es-ES"/>
+        </w:rPr>
+        <w:t xml:space="preserve">, experiencia, </w:t>
+      </w:r>
+      <w:proofErr w:type="spellStart"/>
+      <w:r>
+        <w:rPr>
+          <w:rFonts w:ascii="Arial" w:hAnsi="Arial" w:cs="Arial"/>
+          <w:sz w:val="28"/>
+          <w:lang w:val="es-ES"/>
+        </w:rPr>
         <w:t>codUnidad</w:t>
-      </w:r>
-      <w:proofErr w:type="spellEnd"/>
-      <w:r>
-        <w:rPr>
-          <w:rFonts w:ascii="Arial" w:hAnsi="Arial" w:cs="Arial"/>
-          <w:sz w:val="28"/>
-          <w:lang w:val="es-ES"/>
-        </w:rPr>
-        <w:t xml:space="preserve">, </w:t>
-      </w:r>
-      <w:proofErr w:type="spellStart"/>
-      <w:r>
-        <w:rPr>
-          <w:rFonts w:ascii="Arial" w:hAnsi="Arial" w:cs="Arial"/>
-          <w:sz w:val="28"/>
-          <w:lang w:val="es-ES"/>
-        </w:rPr>
-        <w:t>numHistClinica</w:t>
-      </w:r>
-      <w:proofErr w:type="spellEnd"/>
-      <w:r>
-        <w:rPr>
-          <w:rFonts w:ascii="Arial" w:hAnsi="Arial" w:cs="Arial"/>
-          <w:sz w:val="28"/>
-          <w:lang w:val="es-ES"/>
-        </w:rPr>
-        <w:t xml:space="preserve">) → </w:t>
-      </w:r>
-      <w:proofErr w:type="spellStart"/>
-      <w:r>
-        <w:rPr>
-          <w:rFonts w:ascii="Arial" w:hAnsi="Arial" w:cs="Arial"/>
-          <w:sz w:val="28"/>
-          <w:lang w:val="es-ES"/>
-        </w:rPr>
-        <w:t>nombrePac</w:t>
-      </w:r>
-      <w:proofErr w:type="spellEnd"/>
-      <w:r>
-        <w:rPr>
-          <w:rFonts w:ascii="Arial" w:hAnsi="Arial" w:cs="Arial"/>
-          <w:sz w:val="28"/>
-          <w:lang w:val="es-ES"/>
-        </w:rPr>
-        <w:t xml:space="preserve">, </w:t>
-      </w:r>
-      <w:proofErr w:type="spellStart"/>
-      <w:r>
-        <w:rPr>
-          <w:rFonts w:ascii="Arial" w:hAnsi="Arial" w:cs="Arial"/>
-          <w:sz w:val="28"/>
-          <w:lang w:val="es-ES"/>
-        </w:rPr>
-        <w:t>direccion</w:t>
-      </w:r>
-      <w:proofErr w:type="spellEnd"/>
-      <w:r>
-        <w:rPr>
-          <w:rFonts w:ascii="Arial" w:hAnsi="Arial" w:cs="Arial"/>
-          <w:sz w:val="28"/>
-          <w:lang w:val="es-ES"/>
-        </w:rPr>
-        <w:t>, nacimiento, atendido, causa</w:t>
-      </w:r>
-    </w:p>
-    <w:p>
-      <w:pPr>
-        <w:rPr>
-          <w:rFonts w:ascii="Arial" w:hAnsi="Arial" w:cs="Arial"/>
-          <w:sz w:val="28"/>
-          <w:lang w:val="es-ES"/>
-        </w:rPr>
-      </w:pPr>
-      <w:r>
-        <w:rPr>
-          <w:rFonts w:ascii="Arial" w:hAnsi="Arial" w:cs="Arial"/>
-          <w:sz w:val="28"/>
-          <w:lang w:val="es-ES"/>
-        </w:rPr>
-        <w:t>DF6: (</w:t>
-      </w:r>
-      <w:proofErr w:type="spellStart"/>
-      <w:r>
-        <w:rPr>
-          <w:rFonts w:ascii="Arial" w:hAnsi="Arial" w:cs="Arial"/>
-          <w:sz w:val="28"/>
-          <w:lang w:val="es-ES"/>
-        </w:rPr>
-        <w:t>codUnidad</w:t>
-      </w:r>
-      <w:proofErr w:type="spellEnd"/>
-      <w:r>
-        <w:rPr>
-          <w:rFonts w:ascii="Arial" w:hAnsi="Arial" w:cs="Arial"/>
-          <w:sz w:val="28"/>
-          <w:lang w:val="es-ES"/>
-        </w:rPr>
-        <w:t xml:space="preserve">, </w:t>
-      </w:r>
-      <w:proofErr w:type="spellStart"/>
-      <w:r>
-        <w:rPr>
-          <w:rFonts w:ascii="Arial" w:hAnsi="Arial" w:cs="Arial"/>
-          <w:sz w:val="28"/>
-          <w:lang w:val="es-ES"/>
-        </w:rPr>
-        <w:t>numTurno</w:t>
-      </w:r>
-      <w:proofErr w:type="spellEnd"/>
-      <w:r>
-        <w:rPr>
-          <w:rFonts w:ascii="Arial" w:hAnsi="Arial" w:cs="Arial"/>
-          <w:sz w:val="28"/>
-          <w:lang w:val="es-ES"/>
-        </w:rPr>
-        <w:t xml:space="preserve">) → </w:t>
-      </w:r>
-      <w:proofErr w:type="spellStart"/>
-      <w:r>
-        <w:rPr>
-          <w:rFonts w:ascii="Arial" w:hAnsi="Arial" w:cs="Arial"/>
-          <w:sz w:val="28"/>
-          <w:lang w:val="es-ES"/>
-        </w:rPr>
-        <w:t>cantPacientes</w:t>
-      </w:r>
-      <w:proofErr w:type="spellEnd"/>
-      <w:r>
-        <w:rPr>
-          <w:rFonts w:ascii="Arial" w:hAnsi="Arial" w:cs="Arial"/>
-          <w:sz w:val="28"/>
-          <w:lang w:val="es-ES"/>
-        </w:rPr>
-        <w:t>, pacientesAtend, codMedico</w:t>
-      </w:r>
-    </w:p>
-    <w:p>
-      <w:pPr>
-        <w:rPr>
-          <w:rFonts w:ascii="Arial" w:hAnsi="Arial" w:cs="Arial"/>
-          <w:sz w:val="28"/>
-          <w:lang w:val="es-ES"/>
-        </w:rPr>
-      </w:pPr>
-      <w:r>
-        <w:rPr>
-          <w:rFonts w:ascii="Arial" w:hAnsi="Arial" w:cs="Arial"/>
-          <w:sz w:val="28"/>
-          <w:lang w:val="es-ES"/>
-        </w:rPr>
-        <w:t>DF7: (</w:t>
-      </w:r>
-      <w:proofErr w:type="spellStart"/>
-      <w:r>
-        <w:rPr>
-          <w:rFonts w:ascii="Arial" w:hAnsi="Arial" w:cs="Arial"/>
-          <w:sz w:val="28"/>
-          <w:lang w:val="es-ES"/>
-        </w:rPr>
-        <w:t>codUnidad</w:t>
-      </w:r>
-      <w:proofErr w:type="spellEnd"/>
-      <w:r>
-        <w:rPr>
-          <w:rFonts w:ascii="Arial" w:hAnsi="Arial" w:cs="Arial"/>
-          <w:sz w:val="28"/>
-          <w:lang w:val="es-ES"/>
-        </w:rPr>
-        <w:t xml:space="preserve">, numInforme) → fecha, hora, </w:t>
-      </w:r>
-      <w:proofErr w:type="spellStart"/>
-      <w:r>
-        <w:rPr>
-          <w:rFonts w:ascii="Arial" w:hAnsi="Arial" w:cs="Arial"/>
-          <w:sz w:val="28"/>
-          <w:lang w:val="es-ES"/>
-        </w:rPr>
-        <w:t>pacientesAtendInf</w:t>
-      </w:r>
-      <w:proofErr w:type="spellEnd"/>
-      <w:r>
-        <w:rPr>
-          <w:rFonts w:ascii="Arial" w:hAnsi="Arial" w:cs="Arial"/>
-          <w:sz w:val="28"/>
-          <w:lang w:val="es-ES"/>
-        </w:rPr>
-        <w:t xml:space="preserve">, </w:t>
-      </w:r>
-      <w:proofErr w:type="spellStart"/>
-      <w:r>
-        <w:rPr>
-          <w:rFonts w:ascii="Arial" w:hAnsi="Arial" w:cs="Arial"/>
-          <w:sz w:val="28"/>
-          <w:lang w:val="es-ES"/>
-        </w:rPr>
-        <w:t>pacientesAlta</w:t>
-      </w:r>
-      <w:proofErr w:type="spellEnd"/>
-      <w:r>
-        <w:rPr>
-          <w:rFonts w:ascii="Arial" w:hAnsi="Arial" w:cs="Arial"/>
-          <w:sz w:val="28"/>
-          <w:lang w:val="es-ES"/>
-        </w:rPr>
-        <w:t xml:space="preserve">, </w:t>
-      </w:r>
-      <w:proofErr w:type="spellStart"/>
-      <w:r>
-        <w:rPr>
-          <w:rFonts w:ascii="Arial" w:hAnsi="Arial" w:cs="Arial"/>
-          <w:sz w:val="28"/>
-          <w:lang w:val="es-ES"/>
-        </w:rPr>
-        <w:t>pacientesAdmit</w:t>
-      </w:r>
-      <w:proofErr w:type="spellEnd"/>
-      <w:r>
-        <w:rPr>
-          <w:rFonts w:ascii="Arial" w:hAnsi="Arial" w:cs="Arial"/>
-          <w:sz w:val="28"/>
-          <w:lang w:val="es-ES"/>
-        </w:rPr>
-        <w:t xml:space="preserve">, </w:t>
-      </w:r>
-      <w:proofErr w:type="spellStart"/>
-      <w:r>
-        <w:rPr>
-          <w:rFonts w:ascii="Arial" w:hAnsi="Arial" w:cs="Arial"/>
-          <w:sz w:val="28"/>
-          <w:lang w:val="es-ES"/>
-        </w:rPr>
-        <w:t>pacientesRegist</w:t>
       </w:r>
       <w:proofErr w:type="spellEnd"/>
     </w:p>
@@ -15080,6 +14903,86 @@
           <w:lang w:val="es-ES"/>
         </w:rPr>
       </w:pPr>
+      <w:r>
+        <w:rPr>
+          <w:rFonts w:ascii="Arial" w:hAnsi="Arial" w:cs="Arial"/>
+          <w:sz w:val="28"/>
+          <w:lang w:val="es-ES"/>
+        </w:rPr>
+        <w:t>DF5: (</w:t>
+      </w:r>
+      <w:proofErr w:type="spellStart"/>
+      <w:r>
+        <w:rPr>
+          <w:rFonts w:ascii="Arial" w:hAnsi="Arial" w:cs="Arial"/>
+          <w:sz w:val="28"/>
+          <w:lang w:val="es-ES"/>
+        </w:rPr>
+        <w:t>codUnidad</w:t>
+      </w:r>
+      <w:proofErr w:type="spellEnd"/>
+      <w:r>
+        <w:rPr>
+          <w:rFonts w:ascii="Arial" w:hAnsi="Arial" w:cs="Arial"/>
+          <w:sz w:val="28"/>
+          <w:lang w:val="es-ES"/>
+        </w:rPr>
+        <w:t xml:space="preserve">, </w:t>
+      </w:r>
+      <w:proofErr w:type="spellStart"/>
+      <w:r>
+        <w:rPr>
+          <w:rFonts w:ascii="Arial" w:hAnsi="Arial" w:cs="Arial"/>
+          <w:sz w:val="28"/>
+          <w:lang w:val="es-ES"/>
+        </w:rPr>
+        <w:t>numHistClinica</w:t>
+      </w:r>
+      <w:proofErr w:type="spellEnd"/>
+      <w:r>
+        <w:rPr>
+          <w:rFonts w:ascii="Arial" w:hAnsi="Arial" w:cs="Arial"/>
+          <w:sz w:val="28"/>
+          <w:lang w:val="es-ES"/>
+        </w:rPr>
+        <w:t xml:space="preserve">) → </w:t>
+      </w:r>
+      <w:proofErr w:type="spellStart"/>
+      <w:r>
+        <w:rPr>
+          <w:rFonts w:ascii="Arial" w:hAnsi="Arial" w:cs="Arial"/>
+          <w:sz w:val="28"/>
+          <w:lang w:val="es-ES"/>
+        </w:rPr>
+        <w:t>nombrePac</w:t>
+      </w:r>
+      <w:proofErr w:type="spellEnd"/>
+      <w:r>
+        <w:rPr>
+          <w:rFonts w:ascii="Arial" w:hAnsi="Arial" w:cs="Arial"/>
+          <w:sz w:val="28"/>
+          <w:lang w:val="es-ES"/>
+        </w:rPr>
+        <w:t xml:space="preserve">, </w:t>
+      </w:r>
+      <w:proofErr w:type="spellStart"/>
+      <w:r>
+        <w:rPr>
+          <w:rFonts w:ascii="Arial" w:hAnsi="Arial" w:cs="Arial"/>
+          <w:sz w:val="28"/>
+          <w:lang w:val="es-ES"/>
+        </w:rPr>
+        <w:t>direccion</w:t>
+      </w:r>
+      <w:proofErr w:type="spellEnd"/>
+      <w:r>
+        <w:rPr>
+          <w:rFonts w:ascii="Arial" w:hAnsi="Arial" w:cs="Arial"/>
+          <w:sz w:val="28"/>
+          <w:lang w:val="es-ES"/>
+        </w:rPr>
+        <w:t>, nacimiento, atendido, causa</w:t>
+      </w:r>
     </w:p>
     <w:p>
       <w:pPr>
@@ -15095,7 +14998,7 @@
           <w:sz w:val="28"/>
           <w:lang w:val="es-ES"/>
         </w:rPr>
-        <w:t>Z = {</w:t>
+        <w:t>DF6: (</w:t>
       </w:r>
       <w:proofErr w:type="spellStart"/>
       <w:r>
@@ -15122,7 +15025,7 @@
           <w:sz w:val="28"/>
           <w:lang w:val="es-ES"/>
         </w:rPr>
-        <w:t>numHistClinica</w:t>
+        <w:t>numTurno</w:t>
       </w:r>
       <w:proofErr w:type="spellEnd"/>
       <w:r>
@@ -15131,6 +15034,59 @@
           <w:sz w:val="28"/>
           <w:lang w:val="es-ES"/>
         </w:rPr>
+        <w:t xml:space="preserve">) → </w:t>
+      </w:r>
+      <w:proofErr w:type="spellStart"/>
+      <w:r>
+        <w:rPr>
+          <w:rFonts w:ascii="Arial" w:hAnsi="Arial" w:cs="Arial"/>
+          <w:sz w:val="28"/>
+          <w:lang w:val="es-ES"/>
+        </w:rPr>
+        <w:t>cantPacientes</w:t>
+      </w:r>
+      <w:proofErr w:type="spellEnd"/>
+      <w:r>
+        <w:rPr>
+          <w:rFonts w:ascii="Arial" w:hAnsi="Arial" w:cs="Arial"/>
+          <w:sz w:val="28"/>
+          <w:lang w:val="es-ES"/>
+        </w:rPr>
+        <w:t>, pacientesAtend, codMedico</w:t>
+      </w:r>
+    </w:p>
+    <w:p>
+      <w:pPr>
+        <w:rPr>
+          <w:rFonts w:ascii="Arial" w:hAnsi="Arial" w:cs="Arial"/>
+          <w:sz w:val="28"/>
+          <w:lang w:val="es-ES"/>
+        </w:rPr>
+      </w:pPr>
+      <w:r>
+        <w:rPr>
+          <w:rFonts w:ascii="Arial" w:hAnsi="Arial" w:cs="Arial"/>
+          <w:sz w:val="28"/>
+          <w:lang w:val="es-ES"/>
+        </w:rPr>
+        <w:t>DF7: (</w:t>
+      </w:r>
+      <w:proofErr w:type="spellStart"/>
+      <w:r>
+        <w:rPr>
+          <w:rFonts w:ascii="Arial" w:hAnsi="Arial" w:cs="Arial"/>
+          <w:sz w:val="28"/>
+          <w:lang w:val="es-ES"/>
+        </w:rPr>
+        <w:t>codUnidad</w:t>
+      </w:r>
+      <w:proofErr w:type="spellEnd"/>
+      <w:r>
+        <w:rPr>
+          <w:rFonts w:ascii="Arial" w:hAnsi="Arial" w:cs="Arial"/>
+          <w:sz w:val="28"/>
+          <w:lang w:val="es-ES"/>
+        </w:rPr>
         <w:t xml:space="preserve">, </w:t>
       </w:r>
       <w:proofErr w:type="spellStart"/>
@@ -15140,7 +15096,7 @@
           <w:sz w:val="28"/>
           <w:lang w:val="es-ES"/>
         </w:rPr>
-        <w:t>numTurno</w:t>
+        <w:t>numInforme</w:t>
       </w:r>
       <w:proofErr w:type="spellEnd"/>
       <w:r>
@@ -15149,8 +15105,72 @@
           <w:sz w:val="28"/>
           <w:lang w:val="es-ES"/>
         </w:rPr>
-        <w:t>, numInforme}</w:t>
-      </w:r>
+        <w:t xml:space="preserve">) → fecha, hora, </w:t>
+      </w:r>
+      <w:proofErr w:type="spellStart"/>
+      <w:r>
+        <w:rPr>
+          <w:rFonts w:ascii="Arial" w:hAnsi="Arial" w:cs="Arial"/>
+          <w:sz w:val="28"/>
+          <w:lang w:val="es-ES"/>
+        </w:rPr>
+        <w:t>pacientesAtendInf</w:t>
+      </w:r>
+      <w:proofErr w:type="spellEnd"/>
+      <w:r>
+        <w:rPr>
+          <w:rFonts w:ascii="Arial" w:hAnsi="Arial" w:cs="Arial"/>
+          <w:sz w:val="28"/>
+          <w:lang w:val="es-ES"/>
+        </w:rPr>
+        <w:t xml:space="preserve">, </w:t>
+      </w:r>
+      <w:proofErr w:type="spellStart"/>
+      <w:r>
+        <w:rPr>
+          <w:rFonts w:ascii="Arial" w:hAnsi="Arial" w:cs="Arial"/>
+          <w:sz w:val="28"/>
+          <w:lang w:val="es-ES"/>
+        </w:rPr>
+        <w:t>pacientesAlta</w:t>
+      </w:r>
+      <w:proofErr w:type="spellEnd"/>
+      <w:r>
+        <w:rPr>
+          <w:rFonts w:ascii="Arial" w:hAnsi="Arial" w:cs="Arial"/>
+          <w:sz w:val="28"/>
+          <w:lang w:val="es-ES"/>
+        </w:rPr>
+        <w:t xml:space="preserve">, </w:t>
+      </w:r>
+      <w:proofErr w:type="spellStart"/>
+      <w:r>
+        <w:rPr>
+          <w:rFonts w:ascii="Arial" w:hAnsi="Arial" w:cs="Arial"/>
+          <w:sz w:val="28"/>
+          <w:lang w:val="es-ES"/>
+        </w:rPr>
+        <w:t>pacientesAdmit</w:t>
+      </w:r>
+      <w:proofErr w:type="spellEnd"/>
+      <w:r>
+        <w:rPr>
+          <w:rFonts w:ascii="Arial" w:hAnsi="Arial" w:cs="Arial"/>
+          <w:sz w:val="28"/>
+          <w:lang w:val="es-ES"/>
+        </w:rPr>
+        <w:t xml:space="preserve">, </w:t>
+      </w:r>
+      <w:proofErr w:type="spellStart"/>
+      <w:r>
+        <w:rPr>
+          <w:rFonts w:ascii="Arial" w:hAnsi="Arial" w:cs="Arial"/>
+          <w:sz w:val="28"/>
+          <w:lang w:val="es-ES"/>
+        </w:rPr>
+        <w:t>pacientesRegist</w:t>
+      </w:r>
+      <w:proofErr w:type="spellEnd"/>
     </w:p>
     <w:p>
       <w:pPr>
@@ -15175,7 +15195,7 @@
           <w:sz w:val="28"/>
           <w:lang w:val="es-ES"/>
         </w:rPr>
-        <w:t>1. Aplicar DF5: (</w:t>
+        <w:t>Z = {</w:t>
       </w:r>
       <w:proofErr w:type="spellStart"/>
       <w:r>
@@ -15211,7 +15231,7 @@
           <w:sz w:val="28"/>
           <w:lang w:val="es-ES"/>
         </w:rPr>
-        <w:t xml:space="preserve">) → </w:t>
+        <w:t xml:space="preserve">, </w:t>
       </w:r>
       <w:proofErr w:type="spellStart"/>
       <w:r>
@@ -15220,7 +15240,7 @@
           <w:sz w:val="28"/>
           <w:lang w:val="es-ES"/>
         </w:rPr>
-        <w:t>nombrePac</w:t>
+        <w:t>numTurno</w:t>
       </w:r>
       <w:proofErr w:type="spellEnd"/>
       <w:r>
@@ -15238,7 +15258,7 @@
           <w:sz w:val="28"/>
           <w:lang w:val="es-ES"/>
         </w:rPr>
-        <w:t>direccion</w:t>
+        <w:t>numInforme</w:t>
       </w:r>
       <w:proofErr w:type="spellEnd"/>
       <w:r>
@@ -15247,114 +15267,7 @@
           <w:sz w:val="28"/>
           <w:lang w:val="es-ES"/>
         </w:rPr>
-        <w:t>, nacimiento, atendido, causa</w:t>
-      </w:r>
-    </w:p>
-    <w:p>
-      <w:pPr>
-        <w:rPr>
-          <w:rFonts w:ascii="Arial" w:hAnsi="Arial" w:cs="Arial"/>
-          <w:sz w:val="28"/>
-          <w:lang w:val="es-ES"/>
-        </w:rPr>
-      </w:pPr>
-      <w:r>
-        <w:rPr>
-          <w:rFonts w:ascii="Arial" w:hAnsi="Arial" w:cs="Arial"/>
-          <w:sz w:val="28"/>
-          <w:lang w:val="es-ES"/>
-        </w:rPr>
-        <w:t xml:space="preserve">   Z = {</w:t>
-      </w:r>
-      <w:proofErr w:type="spellStart"/>
-      <w:r>
-        <w:rPr>
-          <w:rFonts w:ascii="Arial" w:hAnsi="Arial" w:cs="Arial"/>
-          <w:sz w:val="28"/>
-          <w:lang w:val="es-ES"/>
-        </w:rPr>
-        <w:t>codUnidad</w:t>
-      </w:r>
-      <w:proofErr w:type="spellEnd"/>
-      <w:r>
-        <w:rPr>
-          <w:rFonts w:ascii="Arial" w:hAnsi="Arial" w:cs="Arial"/>
-          <w:sz w:val="28"/>
-          <w:lang w:val="es-ES"/>
-        </w:rPr>
-        <w:t xml:space="preserve">, </w:t>
-      </w:r>
-      <w:proofErr w:type="spellStart"/>
-      <w:r>
-        <w:rPr>
-          <w:rFonts w:ascii="Arial" w:hAnsi="Arial" w:cs="Arial"/>
-          <w:sz w:val="28"/>
-          <w:lang w:val="es-ES"/>
-        </w:rPr>
-        <w:t>numHistClinica</w:t>
-      </w:r>
-      <w:proofErr w:type="spellEnd"/>
-      <w:r>
-        <w:rPr>
-          <w:rFonts w:ascii="Arial" w:hAnsi="Arial" w:cs="Arial"/>
-          <w:sz w:val="28"/>
-          <w:lang w:val="es-ES"/>
-        </w:rPr>
-        <w:t xml:space="preserve">, </w:t>
-      </w:r>
-      <w:proofErr w:type="spellStart"/>
-      <w:r>
-        <w:rPr>
-          <w:rFonts w:ascii="Arial" w:hAnsi="Arial" w:cs="Arial"/>
-          <w:sz w:val="28"/>
-          <w:lang w:val="es-ES"/>
-        </w:rPr>
-        <w:t>numTurno</w:t>
-      </w:r>
-      <w:proofErr w:type="spellEnd"/>
-      <w:r>
-        <w:rPr>
-          <w:rFonts w:ascii="Arial" w:hAnsi="Arial" w:cs="Arial"/>
-          <w:sz w:val="28"/>
-          <w:lang w:val="es-ES"/>
-        </w:rPr>
-        <w:t xml:space="preserve">, numInforme, </w:t>
-      </w:r>
-      <w:proofErr w:type="spellStart"/>
-      <w:r>
-        <w:rPr>
-          <w:rFonts w:ascii="Arial" w:hAnsi="Arial" w:cs="Arial"/>
-          <w:sz w:val="28"/>
-          <w:lang w:val="es-ES"/>
-        </w:rPr>
-        <w:t>nombrePac</w:t>
-      </w:r>
-      <w:proofErr w:type="spellEnd"/>
-      <w:r>
-        <w:rPr>
-          <w:rFonts w:ascii="Arial" w:hAnsi="Arial" w:cs="Arial"/>
-          <w:sz w:val="28"/>
-          <w:lang w:val="es-ES"/>
-        </w:rPr>
-        <w:t xml:space="preserve">, </w:t>
-      </w:r>
-      <w:proofErr w:type="spellStart"/>
-      <w:r>
-        <w:rPr>
-          <w:rFonts w:ascii="Arial" w:hAnsi="Arial" w:cs="Arial"/>
-          <w:sz w:val="28"/>
-          <w:lang w:val="es-ES"/>
-        </w:rPr>
-        <w:t>direccion</w:t>
-      </w:r>
-      <w:proofErr w:type="spellEnd"/>
-      <w:r>
-        <w:rPr>
-          <w:rFonts w:ascii="Arial" w:hAnsi="Arial" w:cs="Arial"/>
-          <w:sz w:val="28"/>
-          <w:lang w:val="es-ES"/>
-        </w:rPr>
-        <w:t>, nacimiento, atendido, causa}</w:t>
+        <w:t>}</w:t>
       </w:r>
     </w:p>
     <w:p>
@@ -15380,7 +15293,7 @@
           <w:sz w:val="28"/>
           <w:lang w:val="es-ES"/>
         </w:rPr>
-        <w:t>2. Aplicar DF6: (</w:t>
+        <w:t>1. Aplicar DF5: (</w:t>
       </w:r>
       <w:proofErr w:type="spellStart"/>
       <w:r>
@@ -15407,7 +15320,7 @@
           <w:sz w:val="28"/>
           <w:lang w:val="es-ES"/>
         </w:rPr>
-        <w:t>numTurno</w:t>
+        <w:t>numHistClinica</w:t>
       </w:r>
       <w:proofErr w:type="spellEnd"/>
       <w:r>
@@ -15425,7 +15338,7 @@
           <w:sz w:val="28"/>
           <w:lang w:val="es-ES"/>
         </w:rPr>
-        <w:t>cantPacientes</w:t>
+        <w:t>nombrePac</w:t>
       </w:r>
       <w:proofErr w:type="spellEnd"/>
       <w:r>
@@ -15434,7 +15347,25 @@
           <w:sz w:val="28"/>
           <w:lang w:val="es-ES"/>
         </w:rPr>
-        <w:t>, pacientesAtend, codMedico</w:t>
+        <w:t xml:space="preserve">, </w:t>
+      </w:r>
+      <w:proofErr w:type="spellStart"/>
+      <w:r>
+        <w:rPr>
+          <w:rFonts w:ascii="Arial" w:hAnsi="Arial" w:cs="Arial"/>
+          <w:sz w:val="28"/>
+          <w:lang w:val="es-ES"/>
+        </w:rPr>
+        <w:t>direccion</w:t>
+      </w:r>
+      <w:proofErr w:type="spellEnd"/>
+      <w:r>
+        <w:rPr>
+          <w:rFonts w:ascii="Arial" w:hAnsi="Arial" w:cs="Arial"/>
+          <w:sz w:val="28"/>
+          <w:lang w:val="es-ES"/>
+        </w:rPr>
+        <w:t>, nacimiento, atendido, causa</w:t>
       </w:r>
     </w:p>
     <w:p>
@@ -15451,7 +15382,7 @@
           <w:sz w:val="28"/>
           <w:lang w:val="es-ES"/>
         </w:rPr>
-        <w:t xml:space="preserve">   Z = {..., </w:t>
+        <w:t xml:space="preserve">   Z = {</w:t>
       </w:r>
       <w:proofErr w:type="spellStart"/>
       <w:r>
@@ -15460,7 +15391,7 @@
           <w:sz w:val="28"/>
           <w:lang w:val="es-ES"/>
         </w:rPr>
-        <w:t>cantPacientes</w:t>
+        <w:t>codUnidad</w:t>
       </w:r>
       <w:proofErr w:type="spellEnd"/>
       <w:r>
@@ -15469,7 +15400,97 @@
           <w:sz w:val="28"/>
           <w:lang w:val="es-ES"/>
         </w:rPr>
-        <w:t>, pacientesAtend, codMedico}</w:t>
+        <w:t xml:space="preserve">, </w:t>
+      </w:r>
+      <w:proofErr w:type="spellStart"/>
+      <w:r>
+        <w:rPr>
+          <w:rFonts w:ascii="Arial" w:hAnsi="Arial" w:cs="Arial"/>
+          <w:sz w:val="28"/>
+          <w:lang w:val="es-ES"/>
+        </w:rPr>
+        <w:t>numHistClinica</w:t>
+      </w:r>
+      <w:proofErr w:type="spellEnd"/>
+      <w:r>
+        <w:rPr>
+          <w:rFonts w:ascii="Arial" w:hAnsi="Arial" w:cs="Arial"/>
+          <w:sz w:val="28"/>
+          <w:lang w:val="es-ES"/>
+        </w:rPr>
+        <w:t xml:space="preserve">, </w:t>
+      </w:r>
+      <w:proofErr w:type="spellStart"/>
+      <w:r>
+        <w:rPr>
+          <w:rFonts w:ascii="Arial" w:hAnsi="Arial" w:cs="Arial"/>
+          <w:sz w:val="28"/>
+          <w:lang w:val="es-ES"/>
+        </w:rPr>
+        <w:t>numTurno</w:t>
+      </w:r>
+      <w:proofErr w:type="spellEnd"/>
+      <w:r>
+        <w:rPr>
+          <w:rFonts w:ascii="Arial" w:hAnsi="Arial" w:cs="Arial"/>
+          <w:sz w:val="28"/>
+          <w:lang w:val="es-ES"/>
+        </w:rPr>
+        <w:t xml:space="preserve">, </w:t>
+      </w:r>
+      <w:proofErr w:type="spellStart"/>
+      <w:r>
+        <w:rPr>
+          <w:rFonts w:ascii="Arial" w:hAnsi="Arial" w:cs="Arial"/>
+          <w:sz w:val="28"/>
+          <w:lang w:val="es-ES"/>
+        </w:rPr>
+        <w:t>numInforme</w:t>
+      </w:r>
+      <w:proofErr w:type="spellEnd"/>
+      <w:r>
+        <w:rPr>
+          <w:rFonts w:ascii="Arial" w:hAnsi="Arial" w:cs="Arial"/>
+          <w:sz w:val="28"/>
+          <w:lang w:val="es-ES"/>
+        </w:rPr>
+        <w:t xml:space="preserve">, </w:t>
+      </w:r>
+      <w:proofErr w:type="spellStart"/>
+      <w:r>
+        <w:rPr>
+          <w:rFonts w:ascii="Arial" w:hAnsi="Arial" w:cs="Arial"/>
+          <w:sz w:val="28"/>
+          <w:lang w:val="es-ES"/>
+        </w:rPr>
+        <w:t>nombrePac</w:t>
+      </w:r>
+      <w:proofErr w:type="spellEnd"/>
+      <w:r>
+        <w:rPr>
+          <w:rFonts w:ascii="Arial" w:hAnsi="Arial" w:cs="Arial"/>
+          <w:sz w:val="28"/>
+          <w:lang w:val="es-ES"/>
+        </w:rPr>
+        <w:t xml:space="preserve">, </w:t>
+      </w:r>
+      <w:proofErr w:type="spellStart"/>
+      <w:r>
+        <w:rPr>
+          <w:rFonts w:ascii="Arial" w:hAnsi="Arial" w:cs="Arial"/>
+          <w:sz w:val="28"/>
+          <w:lang w:val="es-ES"/>
+        </w:rPr>
+        <w:t>direccion</w:t>
+      </w:r>
+      <w:proofErr w:type="spellEnd"/>
+      <w:r>
+        <w:rPr>
+          <w:rFonts w:ascii="Arial" w:hAnsi="Arial" w:cs="Arial"/>
+          <w:sz w:val="28"/>
+          <w:lang w:val="es-ES"/>
+        </w:rPr>
+        <w:t>, nacimiento, atendido, causa}</w:t>
       </w:r>
     </w:p>
     <w:p>
@@ -15495,6 +15516,157 @@
           <w:sz w:val="28"/>
           <w:lang w:val="es-ES"/>
         </w:rPr>
+        <w:t>2. Aplicar DF6: (</w:t>
+      </w:r>
+      <w:proofErr w:type="spellStart"/>
+      <w:r>
+        <w:rPr>
+          <w:rFonts w:ascii="Arial" w:hAnsi="Arial" w:cs="Arial"/>
+          <w:sz w:val="28"/>
+          <w:lang w:val="es-ES"/>
+        </w:rPr>
+        <w:t>codUnidad</w:t>
+      </w:r>
+      <w:proofErr w:type="spellEnd"/>
+      <w:r>
+        <w:rPr>
+          <w:rFonts w:ascii="Arial" w:hAnsi="Arial" w:cs="Arial"/>
+          <w:sz w:val="28"/>
+          <w:lang w:val="es-ES"/>
+        </w:rPr>
+        <w:t xml:space="preserve">, </w:t>
+      </w:r>
+      <w:proofErr w:type="spellStart"/>
+      <w:r>
+        <w:rPr>
+          <w:rFonts w:ascii="Arial" w:hAnsi="Arial" w:cs="Arial"/>
+          <w:sz w:val="28"/>
+          <w:lang w:val="es-ES"/>
+        </w:rPr>
+        <w:t>numTurno</w:t>
+      </w:r>
+      <w:proofErr w:type="spellEnd"/>
+      <w:r>
+        <w:rPr>
+          <w:rFonts w:ascii="Arial" w:hAnsi="Arial" w:cs="Arial"/>
+          <w:sz w:val="28"/>
+          <w:lang w:val="es-ES"/>
+        </w:rPr>
+        <w:t xml:space="preserve">) → </w:t>
+      </w:r>
+      <w:proofErr w:type="spellStart"/>
+      <w:r>
+        <w:rPr>
+          <w:rFonts w:ascii="Arial" w:hAnsi="Arial" w:cs="Arial"/>
+          <w:sz w:val="28"/>
+          <w:lang w:val="es-ES"/>
+        </w:rPr>
+        <w:t>cantPacientes</w:t>
+      </w:r>
+      <w:proofErr w:type="spellEnd"/>
+      <w:r>
+        <w:rPr>
+          <w:rFonts w:ascii="Arial" w:hAnsi="Arial" w:cs="Arial"/>
+          <w:sz w:val="28"/>
+          <w:lang w:val="es-ES"/>
+        </w:rPr>
+        <w:t>, pacientesAtend, codMedico</w:t>
+      </w:r>
+    </w:p>
+    <w:p>
+      <w:pPr>
+        <w:rPr>
+          <w:rFonts w:ascii="Arial" w:hAnsi="Arial" w:cs="Arial"/>
+          <w:sz w:val="28"/>
+          <w:lang w:val="es-ES"/>
+        </w:rPr>
+      </w:pPr>
+      <w:r>
+        <w:rPr>
+          <w:rFonts w:ascii="Arial" w:hAnsi="Arial" w:cs="Arial"/>
+          <w:sz w:val="28"/>
+          <w:lang w:val="es-ES"/>
+        </w:rPr>
+        <w:t xml:space="preserve">   Z = {..., </w:t>
+      </w:r>
+      <w:proofErr w:type="spellStart"/>
+      <w:r>
+        <w:rPr>
+          <w:rFonts w:ascii="Arial" w:hAnsi="Arial" w:cs="Arial"/>
+          <w:sz w:val="28"/>
+          <w:lang w:val="es-ES"/>
+        </w:rPr>
+        <w:t>cantPacientes</w:t>
+      </w:r>
+      <w:proofErr w:type="spellEnd"/>
+      <w:r>
+        <w:rPr>
+          <w:rFonts w:ascii="Arial" w:hAnsi="Arial" w:cs="Arial"/>
+          <w:sz w:val="28"/>
+          <w:lang w:val="es-ES"/>
+        </w:rPr>
+        <w:t xml:space="preserve">, </w:t>
+      </w:r>
+      <w:proofErr w:type="spellStart"/>
+      <w:r>
+        <w:rPr>
+          <w:rFonts w:ascii="Arial" w:hAnsi="Arial" w:cs="Arial"/>
+          <w:sz w:val="28"/>
+          <w:lang w:val="es-ES"/>
+        </w:rPr>
+        <w:t>pacientesAtend</w:t>
+      </w:r>
+      <w:proofErr w:type="spellEnd"/>
+      <w:r>
+        <w:rPr>
+          <w:rFonts w:ascii="Arial" w:hAnsi="Arial" w:cs="Arial"/>
+          <w:sz w:val="28"/>
+          <w:lang w:val="es-ES"/>
+        </w:rPr>
+        <w:t xml:space="preserve">, </w:t>
+      </w:r>
+      <w:proofErr w:type="spellStart"/>
+      <w:r>
+        <w:rPr>
+          <w:rFonts w:ascii="Arial" w:hAnsi="Arial" w:cs="Arial"/>
+          <w:sz w:val="28"/>
+          <w:lang w:val="es-ES"/>
+        </w:rPr>
+        <w:t>codMedico</w:t>
+      </w:r>
+      <w:proofErr w:type="spellEnd"/>
+      <w:r>
+        <w:rPr>
+          <w:rFonts w:ascii="Arial" w:hAnsi="Arial" w:cs="Arial"/>
+          <w:sz w:val="28"/>
+          <w:lang w:val="es-ES"/>
+        </w:rPr>
+        <w:t>}</w:t>
+      </w:r>
+    </w:p>
+    <w:p>
+      <w:pPr>
+        <w:rPr>
+          <w:rFonts w:ascii="Arial" w:hAnsi="Arial" w:cs="Arial"/>
+          <w:sz w:val="28"/>
+          <w:lang w:val="es-ES"/>
+        </w:rPr>
+      </w:pPr>
+    </w:p>
+    <w:p>
+      <w:pPr>
+        <w:rPr>
+          <w:rFonts w:ascii="Arial" w:hAnsi="Arial" w:cs="Arial"/>
+          <w:sz w:val="28"/>
+          <w:lang w:val="es-ES"/>
+        </w:rPr>
+      </w:pPr>
+      <w:r>
+        <w:rPr>
+          <w:rFonts w:ascii="Arial" w:hAnsi="Arial" w:cs="Arial"/>
+          <w:sz w:val="28"/>
+          <w:lang w:val="es-ES"/>
+        </w:rPr>
         <w:t>3. Aplicar DF7: (</w:t>
       </w:r>
       <w:proofErr w:type="spellStart"/>
@@ -15513,7 +15685,25 @@
           <w:sz w:val="28"/>
           <w:lang w:val="es-ES"/>
         </w:rPr>
-        <w:t xml:space="preserve">, numInforme) → fecha, hora, </w:t>
+        <w:t xml:space="preserve">, </w:t>
+      </w:r>
+      <w:proofErr w:type="spellStart"/>
+      <w:r>
+        <w:rPr>
+          <w:rFonts w:ascii="Arial" w:hAnsi="Arial" w:cs="Arial"/>
+          <w:sz w:val="28"/>
+          <w:lang w:val="es-ES"/>
+        </w:rPr>
+        <w:t>numInforme</w:t>
+      </w:r>
+      <w:proofErr w:type="spellEnd"/>
+      <w:r>
+        <w:rPr>
+          <w:rFonts w:ascii="Arial" w:hAnsi="Arial" w:cs="Arial"/>
+          <w:sz w:val="28"/>
+          <w:lang w:val="es-ES"/>
+        </w:rPr>
+        <w:t xml:space="preserve">) → fecha, hora, </w:t>
       </w:r>
       <w:proofErr w:type="spellStart"/>
       <w:r>
@@ -15692,7 +15882,7 @@
           <w:sz w:val="28"/>
           <w:lang w:val="es-ES"/>
         </w:rPr>
-        <w:t xml:space="preserve">4. Aplicar DF4: codMedico → </w:t>
+        <w:t xml:space="preserve">4. Aplicar DF4: </w:t>
       </w:r>
       <w:proofErr w:type="spellStart"/>
       <w:r>
@@ -15701,6 +15891,24 @@
           <w:sz w:val="28"/>
           <w:lang w:val="es-ES"/>
         </w:rPr>
+        <w:t>codMedico</w:t>
+      </w:r>
+      <w:proofErr w:type="spellEnd"/>
+      <w:r>
+        <w:rPr>
+          <w:rFonts w:ascii="Arial" w:hAnsi="Arial" w:cs="Arial"/>
+          <w:sz w:val="28"/>
+          <w:lang w:val="es-ES"/>
+        </w:rPr>
+        <w:t xml:space="preserve"> → </w:t>
+      </w:r>
+      <w:proofErr w:type="spellStart"/>
+      <w:r>
+        <w:rPr>
+          <w:rFonts w:ascii="Arial" w:hAnsi="Arial" w:cs="Arial"/>
+          <w:sz w:val="28"/>
+          <w:lang w:val="es-ES"/>
+        </w:rPr>
         <w:t>nombreMed</w:t>
       </w:r>
       <w:proofErr w:type="spellEnd"/>
@@ -15728,7 +15936,25 @@
           <w:sz w:val="28"/>
           <w:lang w:val="es-ES"/>
         </w:rPr>
-        <w:t xml:space="preserve">, especialidad, numLicencia, experiencia, </w:t>
+        <w:t xml:space="preserve">, especialidad, </w:t>
+      </w:r>
+      <w:proofErr w:type="spellStart"/>
+      <w:r>
+        <w:rPr>
+          <w:rFonts w:ascii="Arial" w:hAnsi="Arial" w:cs="Arial"/>
+          <w:sz w:val="28"/>
+          <w:lang w:val="es-ES"/>
+        </w:rPr>
+        <w:t>numLicencia</w:t>
+      </w:r>
+      <w:proofErr w:type="spellEnd"/>
+      <w:r>
+        <w:rPr>
+          <w:rFonts w:ascii="Arial" w:hAnsi="Arial" w:cs="Arial"/>
+          <w:sz w:val="28"/>
+          <w:lang w:val="es-ES"/>
+        </w:rPr>
+        <w:t xml:space="preserve">, experiencia, </w:t>
       </w:r>
       <w:proofErr w:type="spellStart"/>
       <w:r>
@@ -15791,7 +16017,25 @@
           <w:sz w:val="28"/>
           <w:lang w:val="es-ES"/>
         </w:rPr>
-        <w:t xml:space="preserve">, especialidad, numLicencia, </w:t>
+        <w:t xml:space="preserve">, especialidad, </w:t>
+      </w:r>
+      <w:proofErr w:type="spellStart"/>
+      <w:r>
+        <w:rPr>
+          <w:rFonts w:ascii="Arial" w:hAnsi="Arial" w:cs="Arial"/>
+          <w:sz w:val="28"/>
+          <w:lang w:val="es-ES"/>
+        </w:rPr>
+        <w:t>numLicencia</w:t>
+      </w:r>
+      <w:proofErr w:type="spellEnd"/>
+      <w:r>
+        <w:rPr>
+          <w:rFonts w:ascii="Arial" w:hAnsi="Arial" w:cs="Arial"/>
+          <w:sz w:val="28"/>
+          <w:lang w:val="es-ES"/>
+        </w:rPr>
+        <w:t xml:space="preserve">, </w:t>
       </w:r>
       <w:proofErr w:type="gramStart"/>
       <w:r>
@@ -16024,8 +16268,36 @@
           <w:sz w:val="28"/>
           <w:lang w:val="es-ES"/>
         </w:rPr>
-        <w:t xml:space="preserve"> → nombreDpt, codHospital</w:t>
-      </w:r>
+        <w:t xml:space="preserve"> → </w:t>
+      </w:r>
+      <w:proofErr w:type="spellStart"/>
+      <w:r>
+        <w:rPr>
+          <w:rFonts w:ascii="Arial" w:hAnsi="Arial" w:cs="Arial"/>
+          <w:sz w:val="28"/>
+          <w:lang w:val="es-ES"/>
+        </w:rPr>
+        <w:t>nombreDpt</w:t>
+      </w:r>
+      <w:proofErr w:type="spellEnd"/>
+      <w:r>
+        <w:rPr>
+          <w:rFonts w:ascii="Arial" w:hAnsi="Arial" w:cs="Arial"/>
+          <w:sz w:val="28"/>
+          <w:lang w:val="es-ES"/>
+        </w:rPr>
+        <w:t xml:space="preserve">, </w:t>
+      </w:r>
+      <w:proofErr w:type="spellStart"/>
+      <w:r>
+        <w:rPr>
+          <w:rFonts w:ascii="Arial" w:hAnsi="Arial" w:cs="Arial"/>
+          <w:sz w:val="28"/>
+          <w:lang w:val="es-ES"/>
+        </w:rPr>
+        <w:t>codHospital</w:t>
+      </w:r>
+      <w:proofErr w:type="spellEnd"/>
     </w:p>
     <w:p>
       <w:pPr>
@@ -16067,7 +16339,25 @@
           <w:sz w:val="28"/>
           <w:lang w:val="es-ES"/>
         </w:rPr>
-        <w:t xml:space="preserve">7. Aplicar DF1: codHospital → </w:t>
+        <w:t xml:space="preserve">7. Aplicar DF1: </w:t>
+      </w:r>
+      <w:proofErr w:type="spellStart"/>
+      <w:r>
+        <w:rPr>
+          <w:rFonts w:ascii="Arial" w:hAnsi="Arial" w:cs="Arial"/>
+          <w:sz w:val="28"/>
+          <w:lang w:val="es-ES"/>
+        </w:rPr>
+        <w:t>codHospital</w:t>
+      </w:r>
+      <w:proofErr w:type="spellEnd"/>
+      <w:r>
+        <w:rPr>
+          <w:rFonts w:ascii="Arial" w:hAnsi="Arial" w:cs="Arial"/>
+          <w:sz w:val="28"/>
+          <w:lang w:val="es-ES"/>
+        </w:rPr>
+        <w:t xml:space="preserve"> → </w:t>
       </w:r>
       <w:proofErr w:type="spellStart"/>
       <w:r>
@@ -16219,7 +16509,25 @@
           <w:sz w:val="28"/>
           <w:lang w:val="es-ES"/>
         </w:rPr>
-        <w:t>, numInforme,</w:t>
+        <w:t xml:space="preserve">, </w:t>
+      </w:r>
+      <w:proofErr w:type="spellStart"/>
+      <w:r>
+        <w:rPr>
+          <w:rFonts w:ascii="Arial" w:hAnsi="Arial" w:cs="Arial"/>
+          <w:sz w:val="28"/>
+          <w:lang w:val="es-ES"/>
+        </w:rPr>
+        <w:t>numInforme</w:t>
+      </w:r>
+      <w:proofErr w:type="spellEnd"/>
+      <w:r>
+        <w:rPr>
+          <w:rFonts w:ascii="Arial" w:hAnsi="Arial" w:cs="Arial"/>
+          <w:sz w:val="28"/>
+          <w:lang w:val="es-ES"/>
+        </w:rPr>
+        <w:t>,</w:t>
       </w:r>
     </w:p>
     <w:p>
@@ -16290,7 +16598,43 @@
           <w:sz w:val="28"/>
           <w:lang w:val="es-ES"/>
         </w:rPr>
-        <w:t xml:space="preserve">, nombreDpt, codHospital, </w:t>
+        <w:t xml:space="preserve">, </w:t>
+      </w:r>
+      <w:proofErr w:type="spellStart"/>
+      <w:r>
+        <w:rPr>
+          <w:rFonts w:ascii="Arial" w:hAnsi="Arial" w:cs="Arial"/>
+          <w:sz w:val="28"/>
+          <w:lang w:val="es-ES"/>
+        </w:rPr>
+        <w:t>nombreDpt</w:t>
+      </w:r>
+      <w:proofErr w:type="spellEnd"/>
+      <w:r>
+        <w:rPr>
+          <w:rFonts w:ascii="Arial" w:hAnsi="Arial" w:cs="Arial"/>
+          <w:sz w:val="28"/>
+          <w:lang w:val="es-ES"/>
+        </w:rPr>
+        <w:t xml:space="preserve">, </w:t>
+      </w:r>
+      <w:proofErr w:type="spellStart"/>
+      <w:r>
+        <w:rPr>
+          <w:rFonts w:ascii="Arial" w:hAnsi="Arial" w:cs="Arial"/>
+          <w:sz w:val="28"/>
+          <w:lang w:val="es-ES"/>
+        </w:rPr>
+        <w:t>codHospital</w:t>
+      </w:r>
+      <w:proofErr w:type="spellEnd"/>
+      <w:r>
+        <w:rPr>
+          <w:rFonts w:ascii="Arial" w:hAnsi="Arial" w:cs="Arial"/>
+          <w:sz w:val="28"/>
+          <w:lang w:val="es-ES"/>
+        </w:rPr>
+        <w:t xml:space="preserve">, </w:t>
       </w:r>
       <w:proofErr w:type="spellStart"/>
       <w:r>
@@ -16396,7 +16740,43 @@
           <w:sz w:val="28"/>
           <w:lang w:val="es-ES"/>
         </w:rPr>
-        <w:t>, pacientesAtend, codMedico,</w:t>
+        <w:t xml:space="preserve">, </w:t>
+      </w:r>
+      <w:proofErr w:type="spellStart"/>
+      <w:r>
+        <w:rPr>
+          <w:rFonts w:ascii="Arial" w:hAnsi="Arial" w:cs="Arial"/>
+          <w:sz w:val="28"/>
+          <w:lang w:val="es-ES"/>
+        </w:rPr>
+        <w:t>pacientesAtend</w:t>
+      </w:r>
+      <w:proofErr w:type="spellEnd"/>
+      <w:r>
+        <w:rPr>
+          <w:rFonts w:ascii="Arial" w:hAnsi="Arial" w:cs="Arial"/>
+          <w:sz w:val="28"/>
+          <w:lang w:val="es-ES"/>
+        </w:rPr>
+        <w:t xml:space="preserve">, </w:t>
+      </w:r>
+      <w:proofErr w:type="spellStart"/>
+      <w:r>
+        <w:rPr>
+          <w:rFonts w:ascii="Arial" w:hAnsi="Arial" w:cs="Arial"/>
+          <w:sz w:val="28"/>
+          <w:lang w:val="es-ES"/>
+        </w:rPr>
+        <w:t>codMedico</w:t>
+      </w:r>
+      <w:proofErr w:type="spellEnd"/>
+      <w:r>
+        <w:rPr>
+          <w:rFonts w:ascii="Arial" w:hAnsi="Arial" w:cs="Arial"/>
+          <w:sz w:val="28"/>
+          <w:lang w:val="es-ES"/>
+        </w:rPr>
+        <w:t>,</w:t>
       </w:r>
     </w:p>
     <w:p>
@@ -16449,7 +16829,25 @@
           <w:sz w:val="28"/>
           <w:lang w:val="es-ES"/>
         </w:rPr>
-        <w:t>, especialidad, numLicencia, experiencia,</w:t>
+        <w:t xml:space="preserve">, especialidad, </w:t>
+      </w:r>
+      <w:proofErr w:type="spellStart"/>
+      <w:r>
+        <w:rPr>
+          <w:rFonts w:ascii="Arial" w:hAnsi="Arial" w:cs="Arial"/>
+          <w:sz w:val="28"/>
+          <w:lang w:val="es-ES"/>
+        </w:rPr>
+        <w:t>numLicencia</w:t>
+      </w:r>
+      <w:proofErr w:type="spellEnd"/>
+      <w:r>
+        <w:rPr>
+          <w:rFonts w:ascii="Arial" w:hAnsi="Arial" w:cs="Arial"/>
+          <w:sz w:val="28"/>
+          <w:lang w:val="es-ES"/>
+        </w:rPr>
+        <w:t>, experiencia,</w:t>
       </w:r>
     </w:p>
     <w:p>
@@ -16611,8 +17009,18 @@
           <w:sz w:val="28"/>
           <w:lang w:val="es-ES"/>
         </w:rPr>
-        <w:t>( codHospital</w:t>
-      </w:r>
+        <w:t xml:space="preserve">( </w:t>
+      </w:r>
+      <w:proofErr w:type="spellStart"/>
+      <w:r>
+        <w:rPr>
+          <w:rFonts w:ascii="Arial" w:hAnsi="Arial" w:cs="Arial"/>
+          <w:sz w:val="28"/>
+          <w:lang w:val="es-ES"/>
+        </w:rPr>
+        <w:t>codHospital</w:t>
+      </w:r>
+      <w:proofErr w:type="spellEnd"/>
       <w:proofErr w:type="gramEnd"/>
       <w:r>
         <w:rPr>
@@ -16683,7 +17091,43 @@
           <w:sz w:val="28"/>
           <w:lang w:val="es-ES"/>
         </w:rPr>
-        <w:t>, nombreDpt, codHospital )  FK: codHospital → HOSPITAL</w:t>
+        <w:t xml:space="preserve">, </w:t>
+      </w:r>
+      <w:proofErr w:type="spellStart"/>
+      <w:r>
+        <w:rPr>
+          <w:rFonts w:ascii="Arial" w:hAnsi="Arial" w:cs="Arial"/>
+          <w:sz w:val="28"/>
+          <w:lang w:val="es-ES"/>
+        </w:rPr>
+        <w:t>nombreDpt</w:t>
+      </w:r>
+      <w:proofErr w:type="spellEnd"/>
+      <w:r>
+        <w:rPr>
+          <w:rFonts w:ascii="Arial" w:hAnsi="Arial" w:cs="Arial"/>
+          <w:sz w:val="28"/>
+          <w:lang w:val="es-ES"/>
+        </w:rPr>
+        <w:t xml:space="preserve">, </w:t>
+      </w:r>
+      <w:proofErr w:type="spellStart"/>
+      <w:r>
+        <w:rPr>
+          <w:rFonts w:ascii="Arial" w:hAnsi="Arial" w:cs="Arial"/>
+          <w:sz w:val="28"/>
+          <w:lang w:val="es-ES"/>
+        </w:rPr>
+        <w:t>codHospital</w:t>
+      </w:r>
+      <w:proofErr w:type="spellEnd"/>
+      <w:r>
+        <w:rPr>
+          <w:rFonts w:ascii="Arial" w:hAnsi="Arial" w:cs="Arial"/>
+          <w:sz w:val="28"/>
+          <w:lang w:val="es-ES"/>
+        </w:rPr>
+        <w:t xml:space="preserve"> )  FK: codHospital → HOSPITAL</w:t>
       </w:r>
     </w:p>
     <w:p>
@@ -16998,7 +17442,7 @@
           <w:sz w:val="28"/>
           <w:lang w:val="es-ES"/>
         </w:rPr>
-        <w:t>, pacientesAtend, codMedico )  FK: (</w:t>
+        <w:t xml:space="preserve">, </w:t>
       </w:r>
       <w:proofErr w:type="spellStart"/>
       <w:r>
@@ -17007,6 +17451,24 @@
           <w:sz w:val="28"/>
           <w:lang w:val="es-ES"/>
         </w:rPr>
+        <w:t>pacientesAtend</w:t>
+      </w:r>
+      <w:proofErr w:type="spellEnd"/>
+      <w:r>
+        <w:rPr>
+          <w:rFonts w:ascii="Arial" w:hAnsi="Arial" w:cs="Arial"/>
+          <w:sz w:val="28"/>
+          <w:lang w:val="es-ES"/>
+        </w:rPr>
+        <w:t>, codMedico )  FK: (</w:t>
+      </w:r>
+      <w:proofErr w:type="spellStart"/>
+      <w:r>
+        <w:rPr>
+          <w:rFonts w:ascii="Arial" w:hAnsi="Arial" w:cs="Arial"/>
+          <w:sz w:val="28"/>
+          <w:lang w:val="es-ES"/>
+        </w:rPr>
         <w:t>codUnidad</w:t>
       </w:r>
       <w:proofErr w:type="spellEnd"/>
@@ -17016,7 +17478,25 @@
           <w:sz w:val="28"/>
           <w:lang w:val="es-ES"/>
         </w:rPr>
-        <w:t>, codMedico) → UNIDAD, MEDICO</w:t>
+        <w:t xml:space="preserve">, </w:t>
+      </w:r>
+      <w:proofErr w:type="spellStart"/>
+      <w:r>
+        <w:rPr>
+          <w:rFonts w:ascii="Arial" w:hAnsi="Arial" w:cs="Arial"/>
+          <w:sz w:val="28"/>
+          <w:lang w:val="es-ES"/>
+        </w:rPr>
+        <w:t>codMedico</w:t>
+      </w:r>
+      <w:proofErr w:type="spellEnd"/>
+      <w:r>
+        <w:rPr>
+          <w:rFonts w:ascii="Arial" w:hAnsi="Arial" w:cs="Arial"/>
+          <w:sz w:val="28"/>
+          <w:lang w:val="es-ES"/>
+        </w:rPr>
+        <w:t>) → UNIDAD, MEDICO</w:t>
       </w:r>
     </w:p>
     <w:p>
@@ -17061,7 +17541,25 @@
           <w:sz w:val="28"/>
           <w:lang w:val="es-ES"/>
         </w:rPr>
-        <w:t xml:space="preserve">, numInforme, fecha, hora, </w:t>
+        <w:t xml:space="preserve">, </w:t>
+      </w:r>
+      <w:proofErr w:type="spellStart"/>
+      <w:r>
+        <w:rPr>
+          <w:rFonts w:ascii="Arial" w:hAnsi="Arial" w:cs="Arial"/>
+          <w:sz w:val="28"/>
+          <w:lang w:val="es-ES"/>
+        </w:rPr>
+        <w:t>numInforme</w:t>
+      </w:r>
+      <w:proofErr w:type="spellEnd"/>
+      <w:r>
+        <w:rPr>
+          <w:rFonts w:ascii="Arial" w:hAnsi="Arial" w:cs="Arial"/>
+          <w:sz w:val="28"/>
+          <w:lang w:val="es-ES"/>
+        </w:rPr>
+        <w:t xml:space="preserve">, fecha, hora, </w:t>
       </w:r>
       <w:proofErr w:type="spellStart"/>
       <w:r>
@@ -17168,7 +17666,15 @@
           <w:sz w:val="28"/>
           <w:lang w:val="es-ES"/>
         </w:rPr>
-        <w:t xml:space="preserve">MEDICO </w:t>
+        <w:t>DOCTOR</w:t>
+      </w:r>
+      <w:r>
+        <w:rPr>
+          <w:rFonts w:ascii="Arial" w:hAnsi="Arial" w:cs="Arial"/>
+          <w:sz w:val="28"/>
+          <w:lang w:val="es-ES"/>
+        </w:rPr>
+        <w:t xml:space="preserve"> </w:t>
       </w:r>
       <w:proofErr w:type="gramStart"/>
       <w:r>
@@ -17177,8 +17683,18 @@
           <w:sz w:val="28"/>
           <w:lang w:val="es-ES"/>
         </w:rPr>
-        <w:t>( codMedico</w:t>
-      </w:r>
+        <w:t xml:space="preserve">( </w:t>
+      </w:r>
+      <w:proofErr w:type="spellStart"/>
+      <w:r>
+        <w:rPr>
+          <w:rFonts w:ascii="Arial" w:hAnsi="Arial" w:cs="Arial"/>
+          <w:sz w:val="28"/>
+          <w:lang w:val="es-ES"/>
+        </w:rPr>
+        <w:t>codMedico</w:t>
+      </w:r>
+      <w:proofErr w:type="spellEnd"/>
       <w:proofErr w:type="gramEnd"/>
       <w:r>
         <w:rPr>
@@ -17222,7 +17738,7 @@
           <w:sz w:val="28"/>
           <w:lang w:val="es-ES"/>
         </w:rPr>
-        <w:t xml:space="preserve">, especialidad, numLicencia, experiencia, </w:t>
+        <w:t xml:space="preserve">, especialidad, </w:t>
       </w:r>
       <w:proofErr w:type="spellStart"/>
       <w:r>
@@ -17231,6 +17747,24 @@
           <w:sz w:val="28"/>
           <w:lang w:val="es-ES"/>
         </w:rPr>
+        <w:t>numLicencia</w:t>
+      </w:r>
+      <w:proofErr w:type="spellEnd"/>
+      <w:r>
+        <w:rPr>
+          <w:rFonts w:ascii="Arial" w:hAnsi="Arial" w:cs="Arial"/>
+          <w:sz w:val="28"/>
+          <w:lang w:val="es-ES"/>
+        </w:rPr>
+        <w:t xml:space="preserve">, experiencia, </w:t>
+      </w:r>
+      <w:proofErr w:type="spellStart"/>
+      <w:r>
+        <w:rPr>
+          <w:rFonts w:ascii="Arial" w:hAnsi="Arial" w:cs="Arial"/>
+          <w:sz w:val="28"/>
+          <w:lang w:val="es-ES"/>
+        </w:rPr>
         <w:t>codUnidad</w:t>
       </w:r>
       <w:proofErr w:type="spellEnd"/>
@@ -17259,6 +17793,733 @@
           <w:lang w:val="es-ES"/>
         </w:rPr>
         <w:t xml:space="preserve"> → UNIDAD</w:t>
+      </w:r>
+    </w:p>
+    <w:p>
+      <w:pPr>
+        <w:rPr>
+          <w:rFonts w:ascii="Arial" w:hAnsi="Arial" w:cs="Arial"/>
+          <w:sz w:val="28"/>
+          <w:lang w:val="es-ES"/>
+        </w:rPr>
+      </w:pPr>
+    </w:p>
+    <w:p>
+      <w:pPr>
+        <w:rPr>
+          <w:rFonts w:ascii="Arial" w:hAnsi="Arial" w:cs="Arial"/>
+          <w:sz w:val="28"/>
+          <w:lang w:val="es-ES"/>
+        </w:rPr>
+      </w:pPr>
+      <w:r>
+        <w:rPr>
+          <w:rFonts w:ascii="Arial" w:hAnsi="Arial" w:cs="Arial"/>
+          <w:sz w:val="28"/>
+          <w:lang w:val="es-ES"/>
+        </w:rPr>
+        <w:t>3FN:</w:t>
+      </w:r>
+    </w:p>
+    <w:p>
+      <w:pPr>
+        <w:rPr>
+          <w:rFonts w:ascii="Arial" w:hAnsi="Arial" w:cs="Arial"/>
+          <w:sz w:val="28"/>
+          <w:lang w:val="es-ES"/>
+        </w:rPr>
+      </w:pPr>
+      <w:r>
+        <w:rPr>
+          <w:rFonts w:ascii="Arial" w:hAnsi="Arial" w:cs="Arial"/>
+          <w:sz w:val="28"/>
+          <w:lang w:val="es-ES"/>
+        </w:rPr>
+        <w:t xml:space="preserve">HOSPITAL </w:t>
+      </w:r>
+      <w:proofErr w:type="gramStart"/>
+      <w:r>
+        <w:rPr>
+          <w:rFonts w:ascii="Arial" w:hAnsi="Arial" w:cs="Arial"/>
+          <w:sz w:val="28"/>
+          <w:lang w:val="es-ES"/>
+        </w:rPr>
+        <w:t xml:space="preserve">( </w:t>
+      </w:r>
+      <w:proofErr w:type="spellStart"/>
+      <w:r>
+        <w:rPr>
+          <w:rFonts w:ascii="Arial" w:hAnsi="Arial" w:cs="Arial"/>
+          <w:sz w:val="28"/>
+          <w:lang w:val="es-ES"/>
+        </w:rPr>
+        <w:t>codHospital</w:t>
+      </w:r>
+      <w:proofErr w:type="spellEnd"/>
+      <w:proofErr w:type="gramEnd"/>
+      <w:r>
+        <w:rPr>
+          <w:rFonts w:ascii="Arial" w:hAnsi="Arial" w:cs="Arial"/>
+          <w:sz w:val="28"/>
+          <w:lang w:val="es-ES"/>
+        </w:rPr>
+        <w:t xml:space="preserve">, </w:t>
+      </w:r>
+      <w:proofErr w:type="spellStart"/>
+      <w:r>
+        <w:rPr>
+          <w:rFonts w:ascii="Arial" w:hAnsi="Arial" w:cs="Arial"/>
+          <w:sz w:val="28"/>
+          <w:lang w:val="es-ES"/>
+        </w:rPr>
+        <w:t>nombreHosp</w:t>
+      </w:r>
+      <w:proofErr w:type="spellEnd"/>
+      <w:r>
+        <w:rPr>
+          <w:rFonts w:ascii="Arial" w:hAnsi="Arial" w:cs="Arial"/>
+          <w:sz w:val="28"/>
+          <w:lang w:val="es-ES"/>
+        </w:rPr>
+        <w:t xml:space="preserve"> )</w:t>
+      </w:r>
+    </w:p>
+    <w:p>
+      <w:pPr>
+        <w:rPr>
+          <w:rFonts w:ascii="Arial" w:hAnsi="Arial" w:cs="Arial"/>
+          <w:sz w:val="28"/>
+          <w:lang w:val="es-ES"/>
+        </w:rPr>
+      </w:pPr>
+      <w:r>
+        <w:rPr>
+          <w:rFonts w:ascii="Arial" w:hAnsi="Arial" w:cs="Arial"/>
+          <w:sz w:val="28"/>
+          <w:lang w:val="es-ES"/>
+        </w:rPr>
+        <w:t xml:space="preserve">DEPARTAMENTO </w:t>
+      </w:r>
+      <w:proofErr w:type="gramStart"/>
+      <w:r>
+        <w:rPr>
+          <w:rFonts w:ascii="Arial" w:hAnsi="Arial" w:cs="Arial"/>
+          <w:sz w:val="28"/>
+          <w:lang w:val="es-ES"/>
+        </w:rPr>
+        <w:t xml:space="preserve">( </w:t>
+      </w:r>
+      <w:proofErr w:type="spellStart"/>
+      <w:r>
+        <w:rPr>
+          <w:rFonts w:ascii="Arial" w:hAnsi="Arial" w:cs="Arial"/>
+          <w:sz w:val="28"/>
+          <w:lang w:val="es-ES"/>
+        </w:rPr>
+        <w:t>codDpt</w:t>
+      </w:r>
+      <w:proofErr w:type="spellEnd"/>
+      <w:proofErr w:type="gramEnd"/>
+      <w:r>
+        <w:rPr>
+          <w:rFonts w:ascii="Arial" w:hAnsi="Arial" w:cs="Arial"/>
+          <w:sz w:val="28"/>
+          <w:lang w:val="es-ES"/>
+        </w:rPr>
+        <w:t xml:space="preserve">, </w:t>
+      </w:r>
+      <w:proofErr w:type="spellStart"/>
+      <w:r>
+        <w:rPr>
+          <w:rFonts w:ascii="Arial" w:hAnsi="Arial" w:cs="Arial"/>
+          <w:sz w:val="28"/>
+          <w:lang w:val="es-ES"/>
+        </w:rPr>
+        <w:t>nombreDpt</w:t>
+      </w:r>
+      <w:proofErr w:type="spellEnd"/>
+      <w:r>
+        <w:rPr>
+          <w:rFonts w:ascii="Arial" w:hAnsi="Arial" w:cs="Arial"/>
+          <w:sz w:val="28"/>
+          <w:lang w:val="es-ES"/>
+        </w:rPr>
+        <w:t xml:space="preserve">, </w:t>
+      </w:r>
+      <w:proofErr w:type="spellStart"/>
+      <w:r>
+        <w:rPr>
+          <w:rFonts w:ascii="Arial" w:hAnsi="Arial" w:cs="Arial"/>
+          <w:sz w:val="28"/>
+          <w:lang w:val="es-ES"/>
+        </w:rPr>
+        <w:t>codHospital</w:t>
+      </w:r>
+      <w:proofErr w:type="spellEnd"/>
+      <w:r>
+        <w:rPr>
+          <w:rFonts w:ascii="Arial" w:hAnsi="Arial" w:cs="Arial"/>
+          <w:sz w:val="28"/>
+          <w:lang w:val="es-ES"/>
+        </w:rPr>
+        <w:t xml:space="preserve"> )</w:t>
+      </w:r>
+    </w:p>
+    <w:p>
+      <w:pPr>
+        <w:rPr>
+          <w:rFonts w:ascii="Arial" w:hAnsi="Arial" w:cs="Arial"/>
+          <w:sz w:val="28"/>
+          <w:lang w:val="es-ES"/>
+        </w:rPr>
+      </w:pPr>
+      <w:r>
+        <w:rPr>
+          <w:rFonts w:ascii="Arial" w:hAnsi="Arial" w:cs="Arial"/>
+          <w:sz w:val="28"/>
+          <w:lang w:val="es-ES"/>
+        </w:rPr>
+        <w:t xml:space="preserve">UNIDAD </w:t>
+      </w:r>
+      <w:proofErr w:type="gramStart"/>
+      <w:r>
+        <w:rPr>
+          <w:rFonts w:ascii="Arial" w:hAnsi="Arial" w:cs="Arial"/>
+          <w:sz w:val="28"/>
+          <w:lang w:val="es-ES"/>
+        </w:rPr>
+        <w:t xml:space="preserve">( </w:t>
+      </w:r>
+      <w:proofErr w:type="spellStart"/>
+      <w:r>
+        <w:rPr>
+          <w:rFonts w:ascii="Arial" w:hAnsi="Arial" w:cs="Arial"/>
+          <w:sz w:val="28"/>
+          <w:lang w:val="es-ES"/>
+        </w:rPr>
+        <w:t>codUnidad</w:t>
+      </w:r>
+      <w:proofErr w:type="spellEnd"/>
+      <w:proofErr w:type="gramEnd"/>
+      <w:r>
+        <w:rPr>
+          <w:rFonts w:ascii="Arial" w:hAnsi="Arial" w:cs="Arial"/>
+          <w:sz w:val="28"/>
+          <w:lang w:val="es-ES"/>
+        </w:rPr>
+        <w:t xml:space="preserve">, </w:t>
+      </w:r>
+      <w:proofErr w:type="spellStart"/>
+      <w:r>
+        <w:rPr>
+          <w:rFonts w:ascii="Arial" w:hAnsi="Arial" w:cs="Arial"/>
+          <w:sz w:val="28"/>
+          <w:lang w:val="es-ES"/>
+        </w:rPr>
+        <w:t>nombreUnidad</w:t>
+      </w:r>
+      <w:proofErr w:type="spellEnd"/>
+      <w:r>
+        <w:rPr>
+          <w:rFonts w:ascii="Arial" w:hAnsi="Arial" w:cs="Arial"/>
+          <w:sz w:val="28"/>
+          <w:lang w:val="es-ES"/>
+        </w:rPr>
+        <w:t xml:space="preserve">, </w:t>
+      </w:r>
+      <w:proofErr w:type="spellStart"/>
+      <w:r>
+        <w:rPr>
+          <w:rFonts w:ascii="Arial" w:hAnsi="Arial" w:cs="Arial"/>
+          <w:sz w:val="28"/>
+          <w:lang w:val="es-ES"/>
+        </w:rPr>
+        <w:t>ubicacion</w:t>
+      </w:r>
+      <w:proofErr w:type="spellEnd"/>
+      <w:r>
+        <w:rPr>
+          <w:rFonts w:ascii="Arial" w:hAnsi="Arial" w:cs="Arial"/>
+          <w:sz w:val="28"/>
+          <w:lang w:val="es-ES"/>
+        </w:rPr>
+        <w:t xml:space="preserve">, </w:t>
+      </w:r>
+      <w:proofErr w:type="spellStart"/>
+      <w:r>
+        <w:rPr>
+          <w:rFonts w:ascii="Arial" w:hAnsi="Arial" w:cs="Arial"/>
+          <w:sz w:val="28"/>
+          <w:lang w:val="es-ES"/>
+        </w:rPr>
+        <w:t>codDpt</w:t>
+      </w:r>
+      <w:proofErr w:type="spellEnd"/>
+      <w:r>
+        <w:rPr>
+          <w:rFonts w:ascii="Arial" w:hAnsi="Arial" w:cs="Arial"/>
+          <w:sz w:val="28"/>
+          <w:lang w:val="es-ES"/>
+        </w:rPr>
+        <w:t xml:space="preserve"> )</w:t>
+      </w:r>
+    </w:p>
+    <w:p>
+      <w:pPr>
+        <w:rPr>
+          <w:rFonts w:ascii="Arial" w:hAnsi="Arial" w:cs="Arial"/>
+          <w:sz w:val="28"/>
+          <w:lang w:val="es-ES"/>
+        </w:rPr>
+      </w:pPr>
+      <w:r>
+        <w:rPr>
+          <w:rFonts w:ascii="Arial" w:hAnsi="Arial" w:cs="Arial"/>
+          <w:sz w:val="28"/>
+          <w:lang w:val="es-ES"/>
+        </w:rPr>
+        <w:t>DOCTOR</w:t>
+      </w:r>
+      <w:r>
+        <w:rPr>
+          <w:rFonts w:ascii="Arial" w:hAnsi="Arial" w:cs="Arial"/>
+          <w:sz w:val="28"/>
+          <w:lang w:val="es-ES"/>
+        </w:rPr>
+        <w:t xml:space="preserve"> </w:t>
+      </w:r>
+      <w:proofErr w:type="gramStart"/>
+      <w:r>
+        <w:rPr>
+          <w:rFonts w:ascii="Arial" w:hAnsi="Arial" w:cs="Arial"/>
+          <w:sz w:val="28"/>
+          <w:lang w:val="es-ES"/>
+        </w:rPr>
+        <w:t xml:space="preserve">( </w:t>
+      </w:r>
+      <w:proofErr w:type="spellStart"/>
+      <w:r>
+        <w:rPr>
+          <w:rFonts w:ascii="Arial" w:hAnsi="Arial" w:cs="Arial"/>
+          <w:sz w:val="28"/>
+          <w:lang w:val="es-ES"/>
+        </w:rPr>
+        <w:t>codMedico</w:t>
+      </w:r>
+      <w:proofErr w:type="spellEnd"/>
+      <w:proofErr w:type="gramEnd"/>
+      <w:r>
+        <w:rPr>
+          <w:rFonts w:ascii="Arial" w:hAnsi="Arial" w:cs="Arial"/>
+          <w:sz w:val="28"/>
+          <w:lang w:val="es-ES"/>
+        </w:rPr>
+        <w:t xml:space="preserve">, </w:t>
+      </w:r>
+      <w:proofErr w:type="spellStart"/>
+      <w:r>
+        <w:rPr>
+          <w:rFonts w:ascii="Arial" w:hAnsi="Arial" w:cs="Arial"/>
+          <w:sz w:val="28"/>
+          <w:lang w:val="es-ES"/>
+        </w:rPr>
+        <w:t>nombreMed</w:t>
+      </w:r>
+      <w:proofErr w:type="spellEnd"/>
+      <w:r>
+        <w:rPr>
+          <w:rFonts w:ascii="Arial" w:hAnsi="Arial" w:cs="Arial"/>
+          <w:sz w:val="28"/>
+          <w:lang w:val="es-ES"/>
+        </w:rPr>
+        <w:t xml:space="preserve">, </w:t>
+      </w:r>
+      <w:proofErr w:type="spellStart"/>
+      <w:r>
+        <w:rPr>
+          <w:rFonts w:ascii="Arial" w:hAnsi="Arial" w:cs="Arial"/>
+          <w:sz w:val="28"/>
+          <w:lang w:val="es-ES"/>
+        </w:rPr>
+        <w:t>telefono</w:t>
+      </w:r>
+      <w:proofErr w:type="spellEnd"/>
+      <w:r>
+        <w:rPr>
+          <w:rFonts w:ascii="Arial" w:hAnsi="Arial" w:cs="Arial"/>
+          <w:sz w:val="28"/>
+          <w:lang w:val="es-ES"/>
+        </w:rPr>
+        <w:t xml:space="preserve">, especialidad, </w:t>
+      </w:r>
+      <w:proofErr w:type="spellStart"/>
+      <w:r>
+        <w:rPr>
+          <w:rFonts w:ascii="Arial" w:hAnsi="Arial" w:cs="Arial"/>
+          <w:sz w:val="28"/>
+          <w:lang w:val="es-ES"/>
+        </w:rPr>
+        <w:t>numLicencia</w:t>
+      </w:r>
+      <w:proofErr w:type="spellEnd"/>
+      <w:r>
+        <w:rPr>
+          <w:rFonts w:ascii="Arial" w:hAnsi="Arial" w:cs="Arial"/>
+          <w:sz w:val="28"/>
+          <w:lang w:val="es-ES"/>
+        </w:rPr>
+        <w:t xml:space="preserve">, experiencia, </w:t>
+      </w:r>
+      <w:proofErr w:type="spellStart"/>
+      <w:r>
+        <w:rPr>
+          <w:rFonts w:ascii="Arial" w:hAnsi="Arial" w:cs="Arial"/>
+          <w:sz w:val="28"/>
+          <w:lang w:val="es-ES"/>
+        </w:rPr>
+        <w:t>codUnidad</w:t>
+      </w:r>
+      <w:proofErr w:type="spellEnd"/>
+      <w:r>
+        <w:rPr>
+          <w:rFonts w:ascii="Arial" w:hAnsi="Arial" w:cs="Arial"/>
+          <w:sz w:val="28"/>
+          <w:lang w:val="es-ES"/>
+        </w:rPr>
+        <w:t xml:space="preserve"> )</w:t>
+      </w:r>
+    </w:p>
+    <w:p>
+      <w:pPr>
+        <w:rPr>
+          <w:rFonts w:ascii="Arial" w:hAnsi="Arial" w:cs="Arial"/>
+          <w:sz w:val="28"/>
+          <w:lang w:val="es-ES"/>
+        </w:rPr>
+      </w:pPr>
+      <w:r>
+        <w:rPr>
+          <w:rFonts w:ascii="Arial" w:hAnsi="Arial" w:cs="Arial"/>
+          <w:sz w:val="28"/>
+          <w:lang w:val="es-ES"/>
+        </w:rPr>
+        <w:t xml:space="preserve">PACIENTE </w:t>
+      </w:r>
+      <w:proofErr w:type="gramStart"/>
+      <w:r>
+        <w:rPr>
+          <w:rFonts w:ascii="Arial" w:hAnsi="Arial" w:cs="Arial"/>
+          <w:sz w:val="28"/>
+          <w:lang w:val="es-ES"/>
+        </w:rPr>
+        <w:t xml:space="preserve">( </w:t>
+      </w:r>
+      <w:proofErr w:type="spellStart"/>
+      <w:r>
+        <w:rPr>
+          <w:rFonts w:ascii="Arial" w:hAnsi="Arial" w:cs="Arial"/>
+          <w:sz w:val="28"/>
+          <w:lang w:val="es-ES"/>
+        </w:rPr>
+        <w:t>codUnidad</w:t>
+      </w:r>
+      <w:proofErr w:type="spellEnd"/>
+      <w:proofErr w:type="gramEnd"/>
+      <w:r>
+        <w:rPr>
+          <w:rFonts w:ascii="Arial" w:hAnsi="Arial" w:cs="Arial"/>
+          <w:sz w:val="28"/>
+          <w:lang w:val="es-ES"/>
+        </w:rPr>
+        <w:t xml:space="preserve">, </w:t>
+      </w:r>
+      <w:proofErr w:type="spellStart"/>
+      <w:r>
+        <w:rPr>
+          <w:rFonts w:ascii="Arial" w:hAnsi="Arial" w:cs="Arial"/>
+          <w:sz w:val="28"/>
+          <w:lang w:val="es-ES"/>
+        </w:rPr>
+        <w:t>numHistClinica</w:t>
+      </w:r>
+      <w:proofErr w:type="spellEnd"/>
+      <w:r>
+        <w:rPr>
+          <w:rFonts w:ascii="Arial" w:hAnsi="Arial" w:cs="Arial"/>
+          <w:sz w:val="28"/>
+          <w:lang w:val="es-ES"/>
+        </w:rPr>
+        <w:t xml:space="preserve">, </w:t>
+      </w:r>
+      <w:proofErr w:type="spellStart"/>
+      <w:r>
+        <w:rPr>
+          <w:rFonts w:ascii="Arial" w:hAnsi="Arial" w:cs="Arial"/>
+          <w:sz w:val="28"/>
+          <w:lang w:val="es-ES"/>
+        </w:rPr>
+        <w:t>nombrePac</w:t>
+      </w:r>
+      <w:proofErr w:type="spellEnd"/>
+      <w:r>
+        <w:rPr>
+          <w:rFonts w:ascii="Arial" w:hAnsi="Arial" w:cs="Arial"/>
+          <w:sz w:val="28"/>
+          <w:lang w:val="es-ES"/>
+        </w:rPr>
+        <w:t xml:space="preserve">, </w:t>
+      </w:r>
+      <w:proofErr w:type="spellStart"/>
+      <w:r>
+        <w:rPr>
+          <w:rFonts w:ascii="Arial" w:hAnsi="Arial" w:cs="Arial"/>
+          <w:sz w:val="28"/>
+          <w:lang w:val="es-ES"/>
+        </w:rPr>
+        <w:t>direccion</w:t>
+      </w:r>
+      <w:proofErr w:type="spellEnd"/>
+      <w:r>
+        <w:rPr>
+          <w:rFonts w:ascii="Arial" w:hAnsi="Arial" w:cs="Arial"/>
+          <w:sz w:val="28"/>
+          <w:lang w:val="es-ES"/>
+        </w:rPr>
+        <w:t>, nacimiento, atendido, causa )</w:t>
+      </w:r>
+    </w:p>
+    <w:p>
+      <w:pPr>
+        <w:rPr>
+          <w:rFonts w:ascii="Arial" w:hAnsi="Arial" w:cs="Arial"/>
+          <w:sz w:val="28"/>
+          <w:lang w:val="es-ES"/>
+        </w:rPr>
+      </w:pPr>
+      <w:r>
+        <w:rPr>
+          <w:rFonts w:ascii="Arial" w:hAnsi="Arial" w:cs="Arial"/>
+          <w:sz w:val="28"/>
+          <w:lang w:val="es-ES"/>
+        </w:rPr>
+        <w:t xml:space="preserve">TURNO </w:t>
+      </w:r>
+      <w:proofErr w:type="gramStart"/>
+      <w:r>
+        <w:rPr>
+          <w:rFonts w:ascii="Arial" w:hAnsi="Arial" w:cs="Arial"/>
+          <w:sz w:val="28"/>
+          <w:lang w:val="es-ES"/>
+        </w:rPr>
+        <w:t xml:space="preserve">( </w:t>
+      </w:r>
+      <w:proofErr w:type="spellStart"/>
+      <w:r>
+        <w:rPr>
+          <w:rFonts w:ascii="Arial" w:hAnsi="Arial" w:cs="Arial"/>
+          <w:sz w:val="28"/>
+          <w:lang w:val="es-ES"/>
+        </w:rPr>
+        <w:t>codUnidad</w:t>
+      </w:r>
+      <w:proofErr w:type="spellEnd"/>
+      <w:proofErr w:type="gramEnd"/>
+      <w:r>
+        <w:rPr>
+          <w:rFonts w:ascii="Arial" w:hAnsi="Arial" w:cs="Arial"/>
+          <w:sz w:val="28"/>
+          <w:lang w:val="es-ES"/>
+        </w:rPr>
+        <w:t xml:space="preserve">, </w:t>
+      </w:r>
+      <w:proofErr w:type="spellStart"/>
+      <w:r>
+        <w:rPr>
+          <w:rFonts w:ascii="Arial" w:hAnsi="Arial" w:cs="Arial"/>
+          <w:sz w:val="28"/>
+          <w:lang w:val="es-ES"/>
+        </w:rPr>
+        <w:t>numTurno</w:t>
+      </w:r>
+      <w:proofErr w:type="spellEnd"/>
+      <w:r>
+        <w:rPr>
+          <w:rFonts w:ascii="Arial" w:hAnsi="Arial" w:cs="Arial"/>
+          <w:sz w:val="28"/>
+          <w:lang w:val="es-ES"/>
+        </w:rPr>
+        <w:t xml:space="preserve">, </w:t>
+      </w:r>
+      <w:proofErr w:type="spellStart"/>
+      <w:r>
+        <w:rPr>
+          <w:rFonts w:ascii="Arial" w:hAnsi="Arial" w:cs="Arial"/>
+          <w:sz w:val="28"/>
+          <w:lang w:val="es-ES"/>
+        </w:rPr>
+        <w:t>cantPacientes</w:t>
+      </w:r>
+      <w:proofErr w:type="spellEnd"/>
+      <w:r>
+        <w:rPr>
+          <w:rFonts w:ascii="Arial" w:hAnsi="Arial" w:cs="Arial"/>
+          <w:sz w:val="28"/>
+          <w:lang w:val="es-ES"/>
+        </w:rPr>
+        <w:t xml:space="preserve">, </w:t>
+      </w:r>
+      <w:proofErr w:type="spellStart"/>
+      <w:r>
+        <w:rPr>
+          <w:rFonts w:ascii="Arial" w:hAnsi="Arial" w:cs="Arial"/>
+          <w:sz w:val="28"/>
+          <w:lang w:val="es-ES"/>
+        </w:rPr>
+        <w:t>pacientesAtend</w:t>
+      </w:r>
+      <w:proofErr w:type="spellEnd"/>
+      <w:r>
+        <w:rPr>
+          <w:rFonts w:ascii="Arial" w:hAnsi="Arial" w:cs="Arial"/>
+          <w:sz w:val="28"/>
+          <w:lang w:val="es-ES"/>
+        </w:rPr>
+        <w:t>, codMedico )</w:t>
+      </w:r>
+    </w:p>
+    <w:p>
+      <w:pPr>
+        <w:rPr>
+          <w:rFonts w:ascii="Arial" w:hAnsi="Arial" w:cs="Arial"/>
+          <w:sz w:val="28"/>
+          <w:lang w:val="es-ES"/>
+        </w:rPr>
+      </w:pPr>
+      <w:r>
+        <w:rPr>
+          <w:rFonts w:ascii="Arial" w:hAnsi="Arial" w:cs="Arial"/>
+          <w:sz w:val="28"/>
+          <w:lang w:val="es-ES"/>
+        </w:rPr>
+        <w:t xml:space="preserve">INFORME </w:t>
+      </w:r>
+      <w:proofErr w:type="gramStart"/>
+      <w:r>
+        <w:rPr>
+          <w:rFonts w:ascii="Arial" w:hAnsi="Arial" w:cs="Arial"/>
+          <w:sz w:val="28"/>
+          <w:lang w:val="es-ES"/>
+        </w:rPr>
+        <w:t xml:space="preserve">( </w:t>
+      </w:r>
+      <w:proofErr w:type="spellStart"/>
+      <w:r>
+        <w:rPr>
+          <w:rFonts w:ascii="Arial" w:hAnsi="Arial" w:cs="Arial"/>
+          <w:sz w:val="28"/>
+          <w:lang w:val="es-ES"/>
+        </w:rPr>
+        <w:t>codUnidad</w:t>
+      </w:r>
+      <w:proofErr w:type="spellEnd"/>
+      <w:proofErr w:type="gramEnd"/>
+      <w:r>
+        <w:rPr>
+          <w:rFonts w:ascii="Arial" w:hAnsi="Arial" w:cs="Arial"/>
+          <w:sz w:val="28"/>
+          <w:lang w:val="es-ES"/>
+        </w:rPr>
+        <w:t xml:space="preserve">, </w:t>
+      </w:r>
+      <w:proofErr w:type="spellStart"/>
+      <w:r>
+        <w:rPr>
+          <w:rFonts w:ascii="Arial" w:hAnsi="Arial" w:cs="Arial"/>
+          <w:sz w:val="28"/>
+          <w:lang w:val="es-ES"/>
+        </w:rPr>
+        <w:t>numInforme</w:t>
+      </w:r>
+      <w:proofErr w:type="spellEnd"/>
+      <w:r>
+        <w:rPr>
+          <w:rFonts w:ascii="Arial" w:hAnsi="Arial" w:cs="Arial"/>
+          <w:sz w:val="28"/>
+          <w:lang w:val="es-ES"/>
+        </w:rPr>
+        <w:t xml:space="preserve">, fecha, hora, </w:t>
+      </w:r>
+      <w:proofErr w:type="spellStart"/>
+      <w:r>
+        <w:rPr>
+          <w:rFonts w:ascii="Arial" w:hAnsi="Arial" w:cs="Arial"/>
+          <w:sz w:val="28"/>
+          <w:lang w:val="es-ES"/>
+        </w:rPr>
+        <w:t>pacientesAtendInf</w:t>
+      </w:r>
+      <w:proofErr w:type="spellEnd"/>
+      <w:r>
+        <w:rPr>
+          <w:rFonts w:ascii="Arial" w:hAnsi="Arial" w:cs="Arial"/>
+          <w:sz w:val="28"/>
+          <w:lang w:val="es-ES"/>
+        </w:rPr>
+        <w:t xml:space="preserve">, </w:t>
+      </w:r>
+      <w:proofErr w:type="spellStart"/>
+      <w:r>
+        <w:rPr>
+          <w:rFonts w:ascii="Arial" w:hAnsi="Arial" w:cs="Arial"/>
+          <w:sz w:val="28"/>
+          <w:lang w:val="es-ES"/>
+        </w:rPr>
+        <w:t>pacientesAlta</w:t>
+      </w:r>
+      <w:proofErr w:type="spellEnd"/>
+      <w:r>
+        <w:rPr>
+          <w:rFonts w:ascii="Arial" w:hAnsi="Arial" w:cs="Arial"/>
+          <w:sz w:val="28"/>
+          <w:lang w:val="es-ES"/>
+        </w:rPr>
+        <w:t xml:space="preserve">, </w:t>
+      </w:r>
+      <w:proofErr w:type="spellStart"/>
+      <w:r>
+        <w:rPr>
+          <w:rFonts w:ascii="Arial" w:hAnsi="Arial" w:cs="Arial"/>
+          <w:sz w:val="28"/>
+          <w:lang w:val="es-ES"/>
+        </w:rPr>
+        <w:t>pacientesAdmit</w:t>
+      </w:r>
+      <w:proofErr w:type="spellEnd"/>
+      <w:r>
+        <w:rPr>
+          <w:rFonts w:ascii="Arial" w:hAnsi="Arial" w:cs="Arial"/>
+          <w:sz w:val="28"/>
+          <w:lang w:val="es-ES"/>
+        </w:rPr>
+        <w:t xml:space="preserve">, </w:t>
+      </w:r>
+      <w:proofErr w:type="spellStart"/>
+      <w:r>
+        <w:rPr>
+          <w:rFonts w:ascii="Arial" w:hAnsi="Arial" w:cs="Arial"/>
+          <w:sz w:val="28"/>
+          <w:lang w:val="es-ES"/>
+        </w:rPr>
+        <w:t>pacientesRegist</w:t>
+      </w:r>
+      <w:proofErr w:type="spellEnd"/>
+      <w:r>
+        <w:rPr>
+          <w:rFonts w:ascii="Arial" w:hAnsi="Arial" w:cs="Arial"/>
+          <w:sz w:val="28"/>
+          <w:lang w:val="es-ES"/>
+        </w:rPr>
+        <w:t xml:space="preserve"> )</w:t>
       </w:r>
     </w:p>
     <w:p>
@@ -17272,685 +18533,13 @@
       <w:bookmarkStart w:id="0" w:name="_GoBack"/>
       <w:bookmarkEnd w:id="0"/>
     </w:p>
-    <w:p>
-      <w:pPr>
-        <w:rPr>
-          <w:rFonts w:ascii="Arial" w:hAnsi="Arial" w:cs="Arial"/>
-          <w:sz w:val="28"/>
-          <w:lang w:val="es-ES"/>
-        </w:rPr>
-      </w:pPr>
-      <w:r>
-        <w:rPr>
-          <w:rFonts w:ascii="Arial" w:hAnsi="Arial" w:cs="Arial"/>
-          <w:sz w:val="28"/>
-          <w:lang w:val="es-ES"/>
-        </w:rPr>
-        <w:t>3FN:</w:t>
-      </w:r>
-    </w:p>
-    <w:p>
-      <w:pPr>
-        <w:rPr>
-          <w:rFonts w:ascii="Arial" w:hAnsi="Arial" w:cs="Arial"/>
-          <w:sz w:val="28"/>
-          <w:lang w:val="es-ES"/>
-        </w:rPr>
-      </w:pPr>
-      <w:r>
-        <w:rPr>
-          <w:rFonts w:ascii="Arial" w:hAnsi="Arial" w:cs="Arial"/>
-          <w:sz w:val="28"/>
-          <w:lang w:val="es-ES"/>
-        </w:rPr>
-        <w:t xml:space="preserve">HOSPITAL </w:t>
-      </w:r>
-      <w:proofErr w:type="gramStart"/>
-      <w:r>
-        <w:rPr>
-          <w:rFonts w:ascii="Arial" w:hAnsi="Arial" w:cs="Arial"/>
-          <w:sz w:val="28"/>
-          <w:lang w:val="es-ES"/>
-        </w:rPr>
-        <w:t>( codHospital</w:t>
-      </w:r>
-      <w:proofErr w:type="gramEnd"/>
-      <w:r>
-        <w:rPr>
-          <w:rFonts w:ascii="Arial" w:hAnsi="Arial" w:cs="Arial"/>
-          <w:sz w:val="28"/>
-          <w:lang w:val="es-ES"/>
-        </w:rPr>
-        <w:t xml:space="preserve">, </w:t>
-      </w:r>
-      <w:proofErr w:type="spellStart"/>
-      <w:r>
-        <w:rPr>
-          <w:rFonts w:ascii="Arial" w:hAnsi="Arial" w:cs="Arial"/>
-          <w:sz w:val="28"/>
-          <w:lang w:val="es-ES"/>
-        </w:rPr>
-        <w:t>nombreHosp</w:t>
-      </w:r>
-      <w:proofErr w:type="spellEnd"/>
-      <w:r>
-        <w:rPr>
-          <w:rFonts w:ascii="Arial" w:hAnsi="Arial" w:cs="Arial"/>
-          <w:sz w:val="28"/>
-          <w:lang w:val="es-ES"/>
-        </w:rPr>
-        <w:t xml:space="preserve"> )</w:t>
-      </w:r>
-    </w:p>
-    <w:p>
-      <w:pPr>
-        <w:rPr>
-          <w:rFonts w:ascii="Arial" w:hAnsi="Arial" w:cs="Arial"/>
-          <w:sz w:val="28"/>
-          <w:lang w:val="es-ES"/>
-        </w:rPr>
-      </w:pPr>
-      <w:r>
-        <w:rPr>
-          <w:rFonts w:ascii="Arial" w:hAnsi="Arial" w:cs="Arial"/>
-          <w:sz w:val="28"/>
-          <w:lang w:val="es-ES"/>
-        </w:rPr>
-        <w:t xml:space="preserve">DEPARTAMENTO </w:t>
-      </w:r>
-      <w:proofErr w:type="gramStart"/>
-      <w:r>
-        <w:rPr>
-          <w:rFonts w:ascii="Arial" w:hAnsi="Arial" w:cs="Arial"/>
-          <w:sz w:val="28"/>
-          <w:lang w:val="es-ES"/>
-        </w:rPr>
-        <w:t xml:space="preserve">( </w:t>
-      </w:r>
-      <w:proofErr w:type="spellStart"/>
-      <w:r>
-        <w:rPr>
-          <w:rFonts w:ascii="Arial" w:hAnsi="Arial" w:cs="Arial"/>
-          <w:sz w:val="28"/>
-          <w:lang w:val="es-ES"/>
-        </w:rPr>
-        <w:t>codDpt</w:t>
-      </w:r>
-      <w:proofErr w:type="spellEnd"/>
-      <w:proofErr w:type="gramEnd"/>
-      <w:r>
-        <w:rPr>
-          <w:rFonts w:ascii="Arial" w:hAnsi="Arial" w:cs="Arial"/>
-          <w:sz w:val="28"/>
-          <w:lang w:val="es-ES"/>
-        </w:rPr>
-        <w:t>, nombreDpt, codHospital )</w:t>
-      </w:r>
-    </w:p>
-    <w:p>
-      <w:pPr>
-        <w:rPr>
-          <w:rFonts w:ascii="Arial" w:hAnsi="Arial" w:cs="Arial"/>
-          <w:sz w:val="28"/>
-          <w:lang w:val="es-ES"/>
-        </w:rPr>
-      </w:pPr>
-      <w:r>
-        <w:rPr>
-          <w:rFonts w:ascii="Arial" w:hAnsi="Arial" w:cs="Arial"/>
-          <w:sz w:val="28"/>
-          <w:lang w:val="es-ES"/>
-        </w:rPr>
-        <w:t xml:space="preserve">UNIDAD </w:t>
-      </w:r>
-      <w:proofErr w:type="gramStart"/>
-      <w:r>
-        <w:rPr>
-          <w:rFonts w:ascii="Arial" w:hAnsi="Arial" w:cs="Arial"/>
-          <w:sz w:val="28"/>
-          <w:lang w:val="es-ES"/>
-        </w:rPr>
-        <w:t xml:space="preserve">( </w:t>
-      </w:r>
-      <w:proofErr w:type="spellStart"/>
-      <w:r>
-        <w:rPr>
-          <w:rFonts w:ascii="Arial" w:hAnsi="Arial" w:cs="Arial"/>
-          <w:sz w:val="28"/>
-          <w:lang w:val="es-ES"/>
-        </w:rPr>
-        <w:t>codUnidad</w:t>
-      </w:r>
-      <w:proofErr w:type="spellEnd"/>
-      <w:proofErr w:type="gramEnd"/>
-      <w:r>
-        <w:rPr>
-          <w:rFonts w:ascii="Arial" w:hAnsi="Arial" w:cs="Arial"/>
-          <w:sz w:val="28"/>
-          <w:lang w:val="es-ES"/>
-        </w:rPr>
-        <w:t xml:space="preserve">, </w:t>
-      </w:r>
-      <w:proofErr w:type="spellStart"/>
-      <w:r>
-        <w:rPr>
-          <w:rFonts w:ascii="Arial" w:hAnsi="Arial" w:cs="Arial"/>
-          <w:sz w:val="28"/>
-          <w:lang w:val="es-ES"/>
-        </w:rPr>
-        <w:t>nombreUnidad</w:t>
-      </w:r>
-      <w:proofErr w:type="spellEnd"/>
-      <w:r>
-        <w:rPr>
-          <w:rFonts w:ascii="Arial" w:hAnsi="Arial" w:cs="Arial"/>
-          <w:sz w:val="28"/>
-          <w:lang w:val="es-ES"/>
-        </w:rPr>
-        <w:t xml:space="preserve">, </w:t>
-      </w:r>
-      <w:proofErr w:type="spellStart"/>
-      <w:r>
-        <w:rPr>
-          <w:rFonts w:ascii="Arial" w:hAnsi="Arial" w:cs="Arial"/>
-          <w:sz w:val="28"/>
-          <w:lang w:val="es-ES"/>
-        </w:rPr>
-        <w:t>ubicacion</w:t>
-      </w:r>
-      <w:proofErr w:type="spellEnd"/>
-      <w:r>
-        <w:rPr>
-          <w:rFonts w:ascii="Arial" w:hAnsi="Arial" w:cs="Arial"/>
-          <w:sz w:val="28"/>
-          <w:lang w:val="es-ES"/>
-        </w:rPr>
-        <w:t xml:space="preserve">, </w:t>
-      </w:r>
-      <w:proofErr w:type="spellStart"/>
-      <w:r>
-        <w:rPr>
-          <w:rFonts w:ascii="Arial" w:hAnsi="Arial" w:cs="Arial"/>
-          <w:sz w:val="28"/>
-          <w:lang w:val="es-ES"/>
-        </w:rPr>
-        <w:t>codDpt</w:t>
-      </w:r>
-      <w:proofErr w:type="spellEnd"/>
-      <w:r>
-        <w:rPr>
-          <w:rFonts w:ascii="Arial" w:hAnsi="Arial" w:cs="Arial"/>
-          <w:sz w:val="28"/>
-          <w:lang w:val="es-ES"/>
-        </w:rPr>
-        <w:t xml:space="preserve"> )</w:t>
-      </w:r>
-    </w:p>
-    <w:p>
-      <w:pPr>
-        <w:rPr>
-          <w:rFonts w:ascii="Arial" w:hAnsi="Arial" w:cs="Arial"/>
-          <w:sz w:val="28"/>
-          <w:lang w:val="es-ES"/>
-        </w:rPr>
-      </w:pPr>
-      <w:r>
-        <w:rPr>
-          <w:rFonts w:ascii="Arial" w:hAnsi="Arial" w:cs="Arial"/>
-          <w:sz w:val="28"/>
-          <w:lang w:val="es-ES"/>
-        </w:rPr>
-        <w:t xml:space="preserve">MEDICO </w:t>
-      </w:r>
-      <w:proofErr w:type="gramStart"/>
-      <w:r>
-        <w:rPr>
-          <w:rFonts w:ascii="Arial" w:hAnsi="Arial" w:cs="Arial"/>
-          <w:sz w:val="28"/>
-          <w:lang w:val="es-ES"/>
-        </w:rPr>
-        <w:t>( codMedico</w:t>
-      </w:r>
-      <w:proofErr w:type="gramEnd"/>
-      <w:r>
-        <w:rPr>
-          <w:rFonts w:ascii="Arial" w:hAnsi="Arial" w:cs="Arial"/>
-          <w:sz w:val="28"/>
-          <w:lang w:val="es-ES"/>
-        </w:rPr>
-        <w:t xml:space="preserve">, </w:t>
-      </w:r>
-      <w:proofErr w:type="spellStart"/>
-      <w:r>
-        <w:rPr>
-          <w:rFonts w:ascii="Arial" w:hAnsi="Arial" w:cs="Arial"/>
-          <w:sz w:val="28"/>
-          <w:lang w:val="es-ES"/>
-        </w:rPr>
-        <w:t>nombreMed</w:t>
-      </w:r>
-      <w:proofErr w:type="spellEnd"/>
-      <w:r>
-        <w:rPr>
-          <w:rFonts w:ascii="Arial" w:hAnsi="Arial" w:cs="Arial"/>
-          <w:sz w:val="28"/>
-          <w:lang w:val="es-ES"/>
-        </w:rPr>
-        <w:t xml:space="preserve">, </w:t>
-      </w:r>
-      <w:proofErr w:type="spellStart"/>
-      <w:r>
-        <w:rPr>
-          <w:rFonts w:ascii="Arial" w:hAnsi="Arial" w:cs="Arial"/>
-          <w:sz w:val="28"/>
-          <w:lang w:val="es-ES"/>
-        </w:rPr>
-        <w:t>telefono</w:t>
-      </w:r>
-      <w:proofErr w:type="spellEnd"/>
-      <w:r>
-        <w:rPr>
-          <w:rFonts w:ascii="Arial" w:hAnsi="Arial" w:cs="Arial"/>
-          <w:sz w:val="28"/>
-          <w:lang w:val="es-ES"/>
-        </w:rPr>
-        <w:t xml:space="preserve">, especialidad, numLicencia, experiencia, </w:t>
-      </w:r>
-      <w:proofErr w:type="spellStart"/>
-      <w:r>
-        <w:rPr>
-          <w:rFonts w:ascii="Arial" w:hAnsi="Arial" w:cs="Arial"/>
-          <w:sz w:val="28"/>
-          <w:lang w:val="es-ES"/>
-        </w:rPr>
-        <w:t>codUnidad</w:t>
-      </w:r>
-      <w:proofErr w:type="spellEnd"/>
-      <w:r>
-        <w:rPr>
-          <w:rFonts w:ascii="Arial" w:hAnsi="Arial" w:cs="Arial"/>
-          <w:sz w:val="28"/>
-          <w:lang w:val="es-ES"/>
-        </w:rPr>
-        <w:t xml:space="preserve"> )</w:t>
-      </w:r>
-    </w:p>
-    <w:p>
-      <w:pPr>
-        <w:rPr>
-          <w:rFonts w:ascii="Arial" w:hAnsi="Arial" w:cs="Arial"/>
-          <w:sz w:val="28"/>
-          <w:lang w:val="es-ES"/>
-        </w:rPr>
-      </w:pPr>
-      <w:r>
-        <w:rPr>
-          <w:rFonts w:ascii="Arial" w:hAnsi="Arial" w:cs="Arial"/>
-          <w:sz w:val="28"/>
-          <w:lang w:val="es-ES"/>
-        </w:rPr>
-        <w:t xml:space="preserve">PACIENTE </w:t>
-      </w:r>
-      <w:proofErr w:type="gramStart"/>
-      <w:r>
-        <w:rPr>
-          <w:rFonts w:ascii="Arial" w:hAnsi="Arial" w:cs="Arial"/>
-          <w:sz w:val="28"/>
-          <w:lang w:val="es-ES"/>
-        </w:rPr>
-        <w:t xml:space="preserve">( </w:t>
-      </w:r>
-      <w:proofErr w:type="spellStart"/>
-      <w:r>
-        <w:rPr>
-          <w:rFonts w:ascii="Arial" w:hAnsi="Arial" w:cs="Arial"/>
-          <w:sz w:val="28"/>
-          <w:lang w:val="es-ES"/>
-        </w:rPr>
-        <w:t>codUnidad</w:t>
-      </w:r>
-      <w:proofErr w:type="spellEnd"/>
-      <w:proofErr w:type="gramEnd"/>
-      <w:r>
-        <w:rPr>
-          <w:rFonts w:ascii="Arial" w:hAnsi="Arial" w:cs="Arial"/>
-          <w:sz w:val="28"/>
-          <w:lang w:val="es-ES"/>
-        </w:rPr>
-        <w:t xml:space="preserve">, </w:t>
-      </w:r>
-      <w:proofErr w:type="spellStart"/>
-      <w:r>
-        <w:rPr>
-          <w:rFonts w:ascii="Arial" w:hAnsi="Arial" w:cs="Arial"/>
-          <w:sz w:val="28"/>
-          <w:lang w:val="es-ES"/>
-        </w:rPr>
-        <w:t>numHistClinica</w:t>
-      </w:r>
-      <w:proofErr w:type="spellEnd"/>
-      <w:r>
-        <w:rPr>
-          <w:rFonts w:ascii="Arial" w:hAnsi="Arial" w:cs="Arial"/>
-          <w:sz w:val="28"/>
-          <w:lang w:val="es-ES"/>
-        </w:rPr>
-        <w:t xml:space="preserve">, </w:t>
-      </w:r>
-      <w:proofErr w:type="spellStart"/>
-      <w:r>
-        <w:rPr>
-          <w:rFonts w:ascii="Arial" w:hAnsi="Arial" w:cs="Arial"/>
-          <w:sz w:val="28"/>
-          <w:lang w:val="es-ES"/>
-        </w:rPr>
-        <w:t>nombrePac</w:t>
-      </w:r>
-      <w:proofErr w:type="spellEnd"/>
-      <w:r>
-        <w:rPr>
-          <w:rFonts w:ascii="Arial" w:hAnsi="Arial" w:cs="Arial"/>
-          <w:sz w:val="28"/>
-          <w:lang w:val="es-ES"/>
-        </w:rPr>
-        <w:t xml:space="preserve">, </w:t>
-      </w:r>
-      <w:proofErr w:type="spellStart"/>
-      <w:r>
-        <w:rPr>
-          <w:rFonts w:ascii="Arial" w:hAnsi="Arial" w:cs="Arial"/>
-          <w:sz w:val="28"/>
-          <w:lang w:val="es-ES"/>
-        </w:rPr>
-        <w:t>direccion</w:t>
-      </w:r>
-      <w:proofErr w:type="spellEnd"/>
-      <w:r>
-        <w:rPr>
-          <w:rFonts w:ascii="Arial" w:hAnsi="Arial" w:cs="Arial"/>
-          <w:sz w:val="28"/>
-          <w:lang w:val="es-ES"/>
-        </w:rPr>
-        <w:t>, nacimiento, atendido, causa )</w:t>
-      </w:r>
-    </w:p>
-    <w:p>
-      <w:pPr>
-        <w:rPr>
-          <w:rFonts w:ascii="Arial" w:hAnsi="Arial" w:cs="Arial"/>
-          <w:sz w:val="28"/>
-          <w:lang w:val="es-ES"/>
-        </w:rPr>
-      </w:pPr>
-      <w:r>
-        <w:rPr>
-          <w:rFonts w:ascii="Arial" w:hAnsi="Arial" w:cs="Arial"/>
-          <w:sz w:val="28"/>
-          <w:lang w:val="es-ES"/>
-        </w:rPr>
-        <w:t xml:space="preserve">TURNO </w:t>
-      </w:r>
-      <w:proofErr w:type="gramStart"/>
-      <w:r>
-        <w:rPr>
-          <w:rFonts w:ascii="Arial" w:hAnsi="Arial" w:cs="Arial"/>
-          <w:sz w:val="28"/>
-          <w:lang w:val="es-ES"/>
-        </w:rPr>
-        <w:t xml:space="preserve">( </w:t>
-      </w:r>
-      <w:proofErr w:type="spellStart"/>
-      <w:r>
-        <w:rPr>
-          <w:rFonts w:ascii="Arial" w:hAnsi="Arial" w:cs="Arial"/>
-          <w:sz w:val="28"/>
-          <w:lang w:val="es-ES"/>
-        </w:rPr>
-        <w:t>codUnidad</w:t>
-      </w:r>
-      <w:proofErr w:type="spellEnd"/>
-      <w:proofErr w:type="gramEnd"/>
-      <w:r>
-        <w:rPr>
-          <w:rFonts w:ascii="Arial" w:hAnsi="Arial" w:cs="Arial"/>
-          <w:sz w:val="28"/>
-          <w:lang w:val="es-ES"/>
-        </w:rPr>
-        <w:t xml:space="preserve">, </w:t>
-      </w:r>
-      <w:proofErr w:type="spellStart"/>
-      <w:r>
-        <w:rPr>
-          <w:rFonts w:ascii="Arial" w:hAnsi="Arial" w:cs="Arial"/>
-          <w:sz w:val="28"/>
-          <w:lang w:val="es-ES"/>
-        </w:rPr>
-        <w:t>numTurno</w:t>
-      </w:r>
-      <w:proofErr w:type="spellEnd"/>
-      <w:r>
-        <w:rPr>
-          <w:rFonts w:ascii="Arial" w:hAnsi="Arial" w:cs="Arial"/>
-          <w:sz w:val="28"/>
-          <w:lang w:val="es-ES"/>
-        </w:rPr>
-        <w:t xml:space="preserve">, </w:t>
-      </w:r>
-      <w:proofErr w:type="spellStart"/>
-      <w:r>
-        <w:rPr>
-          <w:rFonts w:ascii="Arial" w:hAnsi="Arial" w:cs="Arial"/>
-          <w:sz w:val="28"/>
-          <w:lang w:val="es-ES"/>
-        </w:rPr>
-        <w:t>cantPacientes</w:t>
-      </w:r>
-      <w:proofErr w:type="spellEnd"/>
-      <w:r>
-        <w:rPr>
-          <w:rFonts w:ascii="Arial" w:hAnsi="Arial" w:cs="Arial"/>
-          <w:sz w:val="28"/>
-          <w:lang w:val="es-ES"/>
-        </w:rPr>
-        <w:t>, pacientesAtend, codMedico )</w:t>
-      </w:r>
-    </w:p>
-    <w:p>
-      <w:pPr>
-        <w:rPr>
-          <w:rFonts w:ascii="Arial" w:hAnsi="Arial" w:cs="Arial"/>
-          <w:sz w:val="28"/>
-          <w:lang w:val="es-ES"/>
-        </w:rPr>
-      </w:pPr>
-      <w:r>
-        <w:rPr>
-          <w:rFonts w:ascii="Arial" w:hAnsi="Arial" w:cs="Arial"/>
-          <w:sz w:val="28"/>
-          <w:lang w:val="es-ES"/>
-        </w:rPr>
-        <w:t xml:space="preserve">INFORME </w:t>
-      </w:r>
-      <w:proofErr w:type="gramStart"/>
-      <w:r>
-        <w:rPr>
-          <w:rFonts w:ascii="Arial" w:hAnsi="Arial" w:cs="Arial"/>
-          <w:sz w:val="28"/>
-          <w:lang w:val="es-ES"/>
-        </w:rPr>
-        <w:t xml:space="preserve">( </w:t>
-      </w:r>
-      <w:proofErr w:type="spellStart"/>
-      <w:r>
-        <w:rPr>
-          <w:rFonts w:ascii="Arial" w:hAnsi="Arial" w:cs="Arial"/>
-          <w:sz w:val="28"/>
-          <w:lang w:val="es-ES"/>
-        </w:rPr>
-        <w:t>codUnidad</w:t>
-      </w:r>
-      <w:proofErr w:type="spellEnd"/>
-      <w:proofErr w:type="gramEnd"/>
-      <w:r>
-        <w:rPr>
-          <w:rFonts w:ascii="Arial" w:hAnsi="Arial" w:cs="Arial"/>
-          <w:sz w:val="28"/>
-          <w:lang w:val="es-ES"/>
-        </w:rPr>
-        <w:t xml:space="preserve">, numInforme, fecha, hora, </w:t>
-      </w:r>
-      <w:proofErr w:type="spellStart"/>
-      <w:r>
-        <w:rPr>
-          <w:rFonts w:ascii="Arial" w:hAnsi="Arial" w:cs="Arial"/>
-          <w:sz w:val="28"/>
-          <w:lang w:val="es-ES"/>
-        </w:rPr>
-        <w:t>pacientesAtendInf</w:t>
-      </w:r>
-      <w:proofErr w:type="spellEnd"/>
-      <w:r>
-        <w:rPr>
-          <w:rFonts w:ascii="Arial" w:hAnsi="Arial" w:cs="Arial"/>
-          <w:sz w:val="28"/>
-          <w:lang w:val="es-ES"/>
-        </w:rPr>
-        <w:t xml:space="preserve">, </w:t>
-      </w:r>
-      <w:proofErr w:type="spellStart"/>
-      <w:r>
-        <w:rPr>
-          <w:rFonts w:ascii="Arial" w:hAnsi="Arial" w:cs="Arial"/>
-          <w:sz w:val="28"/>
-          <w:lang w:val="es-ES"/>
-        </w:rPr>
-        <w:t>pacientesAlta</w:t>
-      </w:r>
-      <w:proofErr w:type="spellEnd"/>
-      <w:r>
-        <w:rPr>
-          <w:rFonts w:ascii="Arial" w:hAnsi="Arial" w:cs="Arial"/>
-          <w:sz w:val="28"/>
-          <w:lang w:val="es-ES"/>
-        </w:rPr>
-        <w:t xml:space="preserve">, </w:t>
-      </w:r>
-      <w:proofErr w:type="spellStart"/>
-      <w:r>
-        <w:rPr>
-          <w:rFonts w:ascii="Arial" w:hAnsi="Arial" w:cs="Arial"/>
-          <w:sz w:val="28"/>
-          <w:lang w:val="es-ES"/>
-        </w:rPr>
-        <w:t>pacientesAdmit</w:t>
-      </w:r>
-      <w:proofErr w:type="spellEnd"/>
-      <w:r>
-        <w:rPr>
-          <w:rFonts w:ascii="Arial" w:hAnsi="Arial" w:cs="Arial"/>
-          <w:sz w:val="28"/>
-          <w:lang w:val="es-ES"/>
-        </w:rPr>
-        <w:t xml:space="preserve">, </w:t>
-      </w:r>
-      <w:proofErr w:type="spellStart"/>
-      <w:r>
-        <w:rPr>
-          <w:rFonts w:ascii="Arial" w:hAnsi="Arial" w:cs="Arial"/>
-          <w:sz w:val="28"/>
-          <w:lang w:val="es-ES"/>
-        </w:rPr>
-        <w:t>pacientesRegist</w:t>
-      </w:r>
-      <w:proofErr w:type="spellEnd"/>
-      <w:r>
-        <w:rPr>
-          <w:rFonts w:ascii="Arial" w:hAnsi="Arial" w:cs="Arial"/>
-          <w:sz w:val="28"/>
-          <w:lang w:val="es-ES"/>
-        </w:rPr>
-        <w:t xml:space="preserve"> )</w:t>
-      </w:r>
-    </w:p>
-    <w:p>
-      <w:pPr>
-        <w:rPr>
-          <w:rFonts w:ascii="Arial" w:hAnsi="Arial" w:cs="Arial"/>
-          <w:sz w:val="28"/>
-          <w:lang w:val="es-ES"/>
-        </w:rPr>
-      </w:pPr>
-    </w:p>
-    <w:p>
-      <w:pPr>
-        <w:rPr>
-          <w:rFonts w:ascii="Arial" w:hAnsi="Arial" w:cs="Arial"/>
-          <w:sz w:val="28"/>
-          <w:lang w:val="es-ES"/>
-        </w:rPr>
-      </w:pPr>
-    </w:p>
-    <w:p>
-      <w:pPr>
-        <w:rPr>
-          <w:rFonts w:ascii="Arial" w:hAnsi="Arial" w:cs="Arial"/>
-          <w:sz w:val="28"/>
-          <w:lang w:val="es-ES"/>
-        </w:rPr>
-      </w:pPr>
-    </w:p>
-    <w:p>
-      <w:pPr>
-        <w:rPr>
-          <w:rFonts w:ascii="Arial" w:hAnsi="Arial" w:cs="Arial"/>
-          <w:sz w:val="28"/>
-          <w:lang w:val="es-ES"/>
-        </w:rPr>
-      </w:pPr>
-    </w:p>
-    <w:p>
-      <w:pPr>
-        <w:rPr>
-          <w:rFonts w:ascii="Arial" w:hAnsi="Arial" w:cs="Arial"/>
-          <w:sz w:val="28"/>
-          <w:lang w:val="es-ES"/>
-        </w:rPr>
-      </w:pPr>
-    </w:p>
-    <w:p>
-      <w:pPr>
-        <w:rPr>
-          <w:rFonts w:ascii="Arial" w:hAnsi="Arial" w:cs="Arial"/>
-          <w:sz w:val="28"/>
-          <w:lang w:val="es-ES"/>
-        </w:rPr>
-      </w:pPr>
-    </w:p>
-    <w:p>
-      <w:pPr>
-        <w:rPr>
-          <w:rFonts w:ascii="Arial" w:hAnsi="Arial" w:cs="Arial"/>
-          <w:sz w:val="28"/>
-          <w:lang w:val="es-ES"/>
-        </w:rPr>
-      </w:pPr>
-    </w:p>
-    <w:p>
-      <w:pPr>
-        <w:rPr>
-          <w:rFonts w:ascii="Arial" w:hAnsi="Arial" w:cs="Arial"/>
-          <w:sz w:val="28"/>
-          <w:lang w:val="es-ES"/>
-        </w:rPr>
-      </w:pPr>
-    </w:p>
     <w:sectPr>
-      <w:headerReference w:type="even" r:id="rId10"/>
-      <w:headerReference w:type="default" r:id="rId11"/>
-      <w:footerReference w:type="even" r:id="rId12"/>
-      <w:footerReference w:type="default" r:id="rId13"/>
-      <w:headerReference w:type="first" r:id="rId14"/>
-      <w:footerReference w:type="first" r:id="rId15"/>
+      <w:headerReference w:type="even" r:id="rId11"/>
+      <w:headerReference w:type="default" r:id="rId12"/>
+      <w:footerReference w:type="even" r:id="rId13"/>
+      <w:footerReference w:type="default" r:id="rId14"/>
+      <w:headerReference w:type="first" r:id="rId15"/>
+      <w:footerReference w:type="first" r:id="rId16"/>
       <w:pgSz w:w="12240" w:h="15840"/>
       <w:pgMar w:top="1440" w:right="1440" w:bottom="1440" w:left="1440" w:header="720" w:footer="720" w:gutter="0"/>
       <w:cols w:space="720"/>
@@ -18069,16 +18658,8 @@
       <w:rPr>
         <w:lang w:val="es-ES"/>
       </w:rPr>
-      <w:t xml:space="preserve">és </w:t>
+      <w:t>és Piñeda</w:t>
     </w:r>
-    <w:proofErr w:type="spellStart"/>
-    <w:r>
-      <w:rPr>
-        <w:lang w:val="es-ES"/>
-      </w:rPr>
-      <w:t>Piñeda</w:t>
-    </w:r>
-    <w:proofErr w:type="spellEnd"/>
     <w:r>
       <w:rPr>
         <w:lang w:val="es-ES"/>
@@ -18845,7 +19426,7 @@
 </file>
 
 <file path=customXml/itemProps1.xml><?xml version="1.0" encoding="utf-8"?>
-<ds:datastoreItem xmlns:ds="http://schemas.openxmlformats.org/officeDocument/2006/customXml" ds:itemID="{F8C41F77-853E-450B-819D-7D914393AC3D}">
+<ds:datastoreItem xmlns:ds="http://schemas.openxmlformats.org/officeDocument/2006/customXml" ds:itemID="{F808106D-CFBC-40D0-B5A1-F924ED15B182}">
   <ds:schemaRefs>
     <ds:schemaRef ds:uri="http://schemas.openxmlformats.org/officeDocument/2006/bibliography"/>
   </ds:schemaRefs>

</xml_diff>